<commit_message>
docs(prd): cập nhật tài liệu prd v1.1 định dạng word docx
</commit_message>
<xml_diff>
--- a/docs/product/PRD-INTERVIA.docx
+++ b/docs/product/PRD-INTERVIA.docx
@@ -15,7 +15,7 @@
         <w:rPr>
           <w:b/>
         </w:rPr>
-        <w:t>Phiên bản 1.0 · 09/10/2026</w:t>
+        <w:t>Phiên bản 1.1 · 09/10/2026</w:t>
       </w:r>
     </w:p>
     <w:tbl>
@@ -135,7 +135,7 @@
           <w:p>
             <w:r/>
             <w:r>
-              <w:t>INTERVIA Product Contract — INTV-PC-001 Rev 1.0</w:t>
+              <w:t>INTERVIA Product Contract — INTV-PC-001 Rev 1.1</w:t>
             </w:r>
           </w:p>
         </w:tc>
@@ -179,17 +179,34 @@
               <w:t>feat/interview-langgraph</w:t>
             </w:r>
             <w:r>
-              <w:t xml:space="preserve"> (09/10/2026); thư mục </w:t>
+              <w:t xml:space="preserve"> và </w:t>
             </w:r>
             <w:r>
               <w:rPr>
                 <w:rFonts w:ascii="Consolas" w:hAnsi="Consolas"/>
                 <w:color w:val="1B3A6B"/>
               </w:rPr>
+              <w:t>interview-prep-frontend</w:t>
+            </w:r>
+            <w:r>
+              <w:t xml:space="preserve"> (09/10/2026); thư mục </w:t>
+            </w:r>
+            <w:r>
+              <w:rPr>
+                <w:rFonts w:ascii="Consolas" w:hAnsi="Consolas"/>
+                <w:color w:val="1B3A6B"/>
+              </w:rPr>
               <w:t>docs/</w:t>
             </w:r>
             <w:r>
-              <w:t xml:space="preserve"> của repo; khảo sát thị trường 09/10/2026</w:t>
+              <w:t xml:space="preserve"> của repo; khảo sát thị trường 09/10/2026; </w:t>
+            </w:r>
+            <w:r>
+              <w:rPr>
+                <w:rFonts w:ascii="Consolas" w:hAnsi="Consolas"/>
+                <w:color w:val="1B3A6B"/>
+              </w:rPr>
+              <w:t>MARKET-READINESS-AUDIT.md</w:t>
             </w:r>
           </w:p>
         </w:tc>
@@ -390,6 +407,88 @@
             <w:r/>
             <w:r>
               <w:t>Bản thảo đầu tiên. Mục 1–14 rút từ hợp đồng INTV-PC-001 Rev 1.0, mã nguồn hiện tại và khảo sát thị trường ngày 09/10. Thêm 7 tính năng đề xuất F-01 đến F-07 ở mục 7.3. Ghi nhận 3 khoảng trống giữa hợp đồng và code ở mục 13 (RK-1 đến RK-3); RK-2 đã xác nhận là vi phạm đang xảy ra.</w:t>
+            </w:r>
+          </w:p>
+        </w:tc>
+        <w:tc>
+          <w:tcPr>
+            <w:tcW w:type="dxa" w:w="1728"/>
+          </w:tcPr>
+          <w:p>
+            <w:r/>
+            <w:r>
+              <w:t>Nhóm INTERVIA</w:t>
+            </w:r>
+          </w:p>
+        </w:tc>
+      </w:tr>
+      <w:tr>
+        <w:tc>
+          <w:tcPr>
+            <w:tcW w:type="dxa" w:w="1728"/>
+          </w:tcPr>
+          <w:p>
+            <w:r/>
+            <w:r>
+              <w:t>09/10/2026</w:t>
+            </w:r>
+          </w:p>
+        </w:tc>
+        <w:tc>
+          <w:tcPr>
+            <w:tcW w:type="dxa" w:w="1728"/>
+          </w:tcPr>
+          <w:p>
+            <w:r/>
+            <w:r>
+              <w:t>A / M</w:t>
+            </w:r>
+          </w:p>
+        </w:tc>
+        <w:tc>
+          <w:tcPr>
+            <w:tcW w:type="dxa" w:w="1728"/>
+          </w:tcPr>
+          <w:p>
+            <w:r/>
+            <w:r>
+              <w:t>1.1</w:t>
+            </w:r>
+          </w:p>
+        </w:tc>
+        <w:tc>
+          <w:tcPr>
+            <w:tcW w:type="dxa" w:w="1728"/>
+          </w:tcPr>
+          <w:p>
+            <w:r/>
+            <w:r>
+              <w:rPr>
+                <w:b/>
+              </w:rPr>
+              <w:t>Sửa những chỗ v1.0 nói quá so với code</w:t>
+            </w:r>
+            <w:r>
+              <w:t xml:space="preserve"> (sau khi rà toàn bộ backend và frontend): R-05 → Một phần (130 câu seed được chèn thẳng APPROVED, bỏ qua quy trình duyệt, dùng chung một rubric); R-10 → Một phần (khi chấm chỉ gửi tên và mô tả tiêu chí, bỏ qua mốc 0–3, trọng số, ý bắt buộc; </w:t>
+            </w:r>
+            <w:r>
+              <w:rPr>
+                <w:rFonts w:ascii="Consolas" w:hAnsi="Consolas"/>
+                <w:color w:val="1B3A6B"/>
+              </w:rPr>
+              <w:t>what_good_looks_like</w:t>
+            </w:r>
+            <w:r>
+              <w:t xml:space="preserve"> được sinh rồi bỏ); R-12 → Đang vi phạm (endpoint đối chiếu không xác thực, đọc CV không lọc người dùng); giai đoạn VALIDATE chỉ là một câu mẫu, không kiểm tính trung thực. </w:t>
+            </w:r>
+            <w:r>
+              <w:rPr>
+                <w:b/>
+              </w:rPr>
+              <w:t>Thêm</w:t>
+            </w:r>
+            <w:r>
+              <w:t xml:space="preserve"> mục 7.5 Luận điểm khác biệt so với ChatGPT, 7.6 Hồ sơ tiến bộ (P-01 đến P-13), 7.7 Dữ liệu và API, 7.8 Màn hình; F-08 Dán JD của bạn; NFR-08, NFR-09; GC-SEC-02, GC-PROG-01 đến GC-PROG-08; RK-10 đến RK-14. Luật trích dẫn chuyển thành mục 7.9.</w:t>
             </w:r>
           </w:p>
         </w:tc>
@@ -777,6 +876,34 @@
         <w:rPr>
           <w:b/>
         </w:rPr>
+        <w:t>ChatGPT đã làm được phần lớn "luyện phỏng vấn cơ bản".</w:t>
+      </w:r>
+      <w:r>
+        <w:t xml:space="preserve"> Người dùng dán CV và JD, yêu cầu hỏi từng câu, hỏi đào sâu, dùng giọng nói và xin chấm điểm. Hạn chế được nêu: phản hồi có xu hướng dễ dãi nếu không yêu cầu nghiêm khắc, không có điểm số chuẩn hóa, không theo dõi tiến bộ có cấu trúc qua các buổi. [Khảo sát — mockif.com, makeuseof.com, mocky.pro] Vì vậy khác biệt của INTERVIA phải nằm ở chỗ một cuộc chat về cấu trúc không làm được (mục 7.5), không ở việc "hỏi theo CV".</w:t>
+      </w:r>
+    </w:p>
+    <w:p>
+      <w:pPr>
+        <w:pStyle w:val="ListBullet"/>
+      </w:pPr>
+      <w:r>
+        <w:rPr>
+          <w:b/>
+        </w:rPr>
+        <w:t>LLM chấm cùng một câu trả lời có thể cho điểm khác nhau.</w:t>
+      </w:r>
+      <w:r>
+        <w:t xml:space="preserve"> Thay đổi thứ tự tiêu chí, cách đánh nhãn điểm hay nhiệt độ đều làm điểm dao động; nhiệt độ 0 không bảo đảm điểm giống nhau. [Khảo sát — arXiv 2506.22316, arXiv 2603.04417] Mọi biểu đồ "tiến bộ" vẽ từ điểm LLM mà không đo sai số có thể chỉ là vẽ nhiễu.</w:t>
+      </w:r>
+    </w:p>
+    <w:p>
+      <w:pPr>
+        <w:pStyle w:val="ListBullet"/>
+      </w:pPr>
+      <w:r>
+        <w:rPr>
+          <w:b/>
+        </w:rPr>
         <w:t>Không tìm thấy nền tảng luyện phỏng vấn AI tiếng Việt nổi bật.</w:t>
       </w:r>
       <w:r>
@@ -1080,6 +1207,41 @@
           </w:p>
         </w:tc>
       </w:tr>
+      <w:tr>
+        <w:tc>
+          <w:tcPr>
+            <w:tcW w:type="dxa" w:w="2880"/>
+          </w:tcPr>
+          <w:p>
+            <w:r/>
+            <w:r>
+              <w:t>G-5</w:t>
+            </w:r>
+          </w:p>
+        </w:tc>
+        <w:tc>
+          <w:tcPr>
+            <w:tcW w:type="dxa" w:w="2880"/>
+          </w:tcPr>
+          <w:p>
+            <w:r/>
+            <w:r>
+              <w:t>Ứng viên thấy được mình tiến bộ ở kỹ năng nào, có khoảng tin cậy, và chỉ được báo "tiến bộ" khi thay đổi vượt sai số chấm đã đo.</w:t>
+            </w:r>
+          </w:p>
+        </w:tc>
+        <w:tc>
+          <w:tcPr>
+            <w:tcW w:type="dxa" w:w="2880"/>
+          </w:tcPr>
+          <w:p>
+            <w:r/>
+            <w:r>
+              <w:t>Hợp đồng §1.4, SF-07</w:t>
+            </w:r>
+          </w:p>
+        </w:tc>
+      </w:tr>
     </w:tbl>
     <w:p/>
     <w:p>
@@ -1438,6 +1600,111 @@
           </w:p>
         </w:tc>
       </w:tr>
+      <w:tr>
+        <w:tc>
+          <w:tcPr>
+            <w:tcW w:type="dxa" w:w="2880"/>
+          </w:tcPr>
+          <w:p>
+            <w:r/>
+            <w:r>
+              <w:t>N-7</w:t>
+            </w:r>
+          </w:p>
+        </w:tc>
+        <w:tc>
+          <w:tcPr>
+            <w:tcW w:type="dxa" w:w="2880"/>
+          </w:tcPr>
+          <w:p>
+            <w:r/>
+            <w:r>
+              <w:t>Biết tiến bộ của mình là thật hay chỉ do AI chấm lúc dễ lúc khó.</w:t>
+            </w:r>
+          </w:p>
+        </w:tc>
+        <w:tc>
+          <w:tcPr>
+            <w:tcW w:type="dxa" w:w="2880"/>
+          </w:tcPr>
+          <w:p>
+            <w:r/>
+            <w:r>
+              <w:t>Khảo sát — arXiv 2506.22316; Giả định</w:t>
+            </w:r>
+          </w:p>
+        </w:tc>
+      </w:tr>
+      <w:tr>
+        <w:tc>
+          <w:tcPr>
+            <w:tcW w:type="dxa" w:w="2880"/>
+          </w:tcPr>
+          <w:p>
+            <w:r/>
+            <w:r>
+              <w:t>N-8</w:t>
+            </w:r>
+          </w:p>
+        </w:tc>
+        <w:tc>
+          <w:tcPr>
+            <w:tcW w:type="dxa" w:w="2880"/>
+          </w:tcPr>
+          <w:p>
+            <w:r/>
+            <w:r>
+              <w:t>Biết còn bao xa mới sẵn sàng cho đúng JD mình sắp phỏng vấn, và nên luyện gì tiếp.</w:t>
+            </w:r>
+          </w:p>
+        </w:tc>
+        <w:tc>
+          <w:tcPr>
+            <w:tcW w:type="dxa" w:w="2880"/>
+          </w:tcPr>
+          <w:p>
+            <w:r/>
+            <w:r>
+              <w:t>Khảo sát — Interview Prep Academy (Readiness Dashboard); Code — frontend đang hiển thị "—"</w:t>
+            </w:r>
+          </w:p>
+        </w:tc>
+      </w:tr>
+      <w:tr>
+        <w:tc>
+          <w:tcPr>
+            <w:tcW w:type="dxa" w:w="2880"/>
+          </w:tcPr>
+          <w:p>
+            <w:r/>
+            <w:r>
+              <w:t>N-9</w:t>
+            </w:r>
+          </w:p>
+        </w:tc>
+        <w:tc>
+          <w:tcPr>
+            <w:tcW w:type="dxa" w:w="2880"/>
+          </w:tcPr>
+          <w:p>
+            <w:r/>
+            <w:r>
+              <w:t>Luyện được với JD của chính mình, không chỉ JD có sẵn trong hệ thống.</w:t>
+            </w:r>
+          </w:p>
+        </w:tc>
+        <w:tc>
+          <w:tcPr>
+            <w:tcW w:type="dxa" w:w="2880"/>
+          </w:tcPr>
+          <w:p>
+            <w:r/>
+            <w:r>
+              <w:t>Code — ứng viên chỉ chọn được JD do quản trị viên đăng</w:t>
+            </w:r>
+          </w:p>
+        </w:tc>
+      </w:tr>
     </w:tbl>
     <w:p/>
     <w:p>
@@ -1864,6 +2131,181 @@
             <w:r/>
             <w:r>
               <w:t>NFR-06</w:t>
+            </w:r>
+          </w:p>
+        </w:tc>
+      </w:tr>
+      <w:tr>
+        <w:tc>
+          <w:tcPr>
+            <w:tcW w:type="dxa" w:w="2880"/>
+          </w:tcPr>
+          <w:p>
+            <w:r/>
+            <w:r>
+              <w:t>US-11</w:t>
+            </w:r>
+          </w:p>
+        </w:tc>
+        <w:tc>
+          <w:tcPr>
+            <w:tcW w:type="dxa" w:w="2880"/>
+          </w:tcPr>
+          <w:p>
+            <w:r/>
+            <w:r>
+              <w:t>Là ứng viên đã luyện nhiều buổi, tôi muốn xem từng kỹ năng của mình thay đổi ra sao theo thời gian, kể cả khi các buổi dùng JD khác nhau.</w:t>
+            </w:r>
+          </w:p>
+        </w:tc>
+        <w:tc>
+          <w:tcPr>
+            <w:tcW w:type="dxa" w:w="2880"/>
+          </w:tcPr>
+          <w:p>
+            <w:r/>
+            <w:r>
+              <w:t>N-4, N-7 · P-01, P-04</w:t>
+            </w:r>
+          </w:p>
+        </w:tc>
+      </w:tr>
+      <w:tr>
+        <w:tc>
+          <w:tcPr>
+            <w:tcW w:type="dxa" w:w="2880"/>
+          </w:tcPr>
+          <w:p>
+            <w:r/>
+            <w:r>
+              <w:t>US-12</w:t>
+            </w:r>
+          </w:p>
+        </w:tc>
+        <w:tc>
+          <w:tcPr>
+            <w:tcW w:type="dxa" w:w="2880"/>
+          </w:tcPr>
+          <w:p>
+            <w:r/>
+            <w:r>
+              <w:t>Là ứng viên, tôi muốn trả lời lại đúng câu tôi từng trả lời và xem hai câu trả lời cạnh nhau, tiêu chí nào đã lên mức.</w:t>
+            </w:r>
+          </w:p>
+        </w:tc>
+        <w:tc>
+          <w:tcPr>
+            <w:tcW w:type="dxa" w:w="2880"/>
+          </w:tcPr>
+          <w:p>
+            <w:r/>
+            <w:r>
+              <w:t>N-4 · P-05, P-06</w:t>
+            </w:r>
+          </w:p>
+        </w:tc>
+      </w:tr>
+      <w:tr>
+        <w:tc>
+          <w:tcPr>
+            <w:tcW w:type="dxa" w:w="2880"/>
+          </w:tcPr>
+          <w:p>
+            <w:r/>
+            <w:r>
+              <w:t>US-13</w:t>
+            </w:r>
+          </w:p>
+        </w:tc>
+        <w:tc>
+          <w:tcPr>
+            <w:tcW w:type="dxa" w:w="2880"/>
+          </w:tcPr>
+          <w:p>
+            <w:r/>
+            <w:r>
+              <w:t>Là ứng viên sắp phỏng vấn thật, tôi muốn nhập ngày phỏng vấn và JD mục tiêu, để nhận kế hoạch luyện đến ngày đó và biết mình đang ở mức sẵn sàng nào.</w:t>
+            </w:r>
+          </w:p>
+        </w:tc>
+        <w:tc>
+          <w:tcPr>
+            <w:tcW w:type="dxa" w:w="2880"/>
+          </w:tcPr>
+          <w:p>
+            <w:r/>
+            <w:r>
+              <w:t>N-8 · P-08, P-09, P-10</w:t>
+            </w:r>
+          </w:p>
+        </w:tc>
+      </w:tr>
+      <w:tr>
+        <w:tc>
+          <w:tcPr>
+            <w:tcW w:type="dxa" w:w="2880"/>
+          </w:tcPr>
+          <w:p>
+            <w:r/>
+            <w:r>
+              <w:t>US-14</w:t>
+            </w:r>
+          </w:p>
+        </w:tc>
+        <w:tc>
+          <w:tcPr>
+            <w:tcW w:type="dxa" w:w="2880"/>
+          </w:tcPr>
+          <w:p>
+            <w:r/>
+            <w:r>
+              <w:t>Là ứng viên, tôi muốn biết những điều tôi ghi trong CV mà tôi chưa bảo vệ được khi bị hỏi đào sâu.</w:t>
+            </w:r>
+          </w:p>
+        </w:tc>
+        <w:tc>
+          <w:tcPr>
+            <w:tcW w:type="dxa" w:w="2880"/>
+          </w:tcPr>
+          <w:p>
+            <w:r/>
+            <w:r>
+              <w:t>N-1 · P-07</w:t>
+            </w:r>
+          </w:p>
+        </w:tc>
+      </w:tr>
+      <w:tr>
+        <w:tc>
+          <w:tcPr>
+            <w:tcW w:type="dxa" w:w="2880"/>
+          </w:tcPr>
+          <w:p>
+            <w:r/>
+            <w:r>
+              <w:t>US-15</w:t>
+            </w:r>
+          </w:p>
+        </w:tc>
+        <w:tc>
+          <w:tcPr>
+            <w:tcW w:type="dxa" w:w="2880"/>
+          </w:tcPr>
+          <w:p>
+            <w:r/>
+            <w:r>
+              <w:t>Là ứng viên, tôi muốn xóa CV cũ mà không mất lịch sử luyện tập.</w:t>
+            </w:r>
+          </w:p>
+        </w:tc>
+        <w:tc>
+          <w:tcPr>
+            <w:tcW w:type="dxa" w:w="2880"/>
+          </w:tcPr>
+          <w:p>
+            <w:r/>
+            <w:r>
+              <w:t>N-4, N-5 · P-12</w:t>
             </w:r>
           </w:p>
         </w:tc>
@@ -2094,6 +2536,28 @@
               </w:rPr>
               <w:t>planning/project_evidence.py</w:t>
             </w:r>
+            <w:r>
+              <w:t xml:space="preserve">. Lưu ý: giai đoạn VALIDATE hiện là </w:t>
+            </w:r>
+            <w:r>
+              <w:rPr>
+                <w:b/>
+              </w:rPr>
+              <w:t>một câu hỏi mẫu</w:t>
+            </w:r>
+            <w:r>
+              <w:t xml:space="preserve"> dựng từ vai trò, công nghệ, số liệu của dự án liên quan JD nhất; không có rubric, không đối chiếu câu trả lời với CV; </w:t>
+            </w:r>
+            <w:r>
+              <w:rPr>
+                <w:rFonts w:ascii="Consolas" w:hAnsi="Consolas"/>
+                <w:color w:val="1B3A6B"/>
+              </w:rPr>
+              <w:t>FAST_FAIL_VALIDATION</w:t>
+            </w:r>
+            <w:r>
+              <w:t xml:space="preserve"> được khai báo nhưng không bao giờ phát ra.</w:t>
+            </w:r>
           </w:p>
         </w:tc>
       </w:tr>
@@ -2198,6 +2662,38 @@
               </w:rPr>
               <w:t>src/modules/question_bank/</w:t>
             </w:r>
+            <w:r>
+              <w:t xml:space="preserve"> · </w:t>
+            </w:r>
+            <w:r>
+              <w:rPr>
+                <w:b/>
+              </w:rPr>
+              <w:t>Một phần:</w:t>
+            </w:r>
+            <w:r>
+              <w:t xml:space="preserve"> quy trình duyệt có thật trong </w:t>
+            </w:r>
+            <w:r>
+              <w:rPr>
+                <w:rFonts w:ascii="Consolas" w:hAnsi="Consolas"/>
+                <w:color w:val="1B3A6B"/>
+              </w:rPr>
+              <w:t>question_bank/service.py</w:t>
+            </w:r>
+            <w:r>
+              <w:t>, nhưng 130 câu seed được chèn thẳng ở trạng thái APPROVED (</w:t>
+            </w:r>
+            <w:r>
+              <w:rPr>
+                <w:rFonts w:ascii="Consolas" w:hAnsi="Consolas"/>
+                <w:color w:val="1B3A6B"/>
+              </w:rPr>
+              <w:t>src/seeds/question_bank_seed.py</w:t>
+            </w:r>
+            <w:r>
+              <w:t>) và dùng chung một rubric Relevance/Depth/Clarity không có ý bắt buộc.</w:t>
+            </w:r>
           </w:p>
         </w:tc>
       </w:tr>
@@ -2442,37 +2938,56 @@
               <w:t>evaluation/evaluation_types.py</w:t>
             </w:r>
             <w:r>
-              <w:t xml:space="preserve">. Lưu ý: </w:t>
+              <w:t xml:space="preserve">. </w:t>
+            </w:r>
+            <w:r>
+              <w:rPr>
+                <w:b/>
+              </w:rPr>
+              <w:t>Một phần:</w:t>
+            </w:r>
+            <w:r>
+              <w:t xml:space="preserve"> khi chấm, </w:t>
             </w:r>
             <w:r>
               <w:rPr>
                 <w:rFonts w:ascii="Consolas" w:hAnsi="Consolas"/>
                 <w:color w:val="1B3A6B"/>
               </w:rPr>
-              <w:t>GET /evaluation</w:t>
-            </w:r>
-            <w:r>
-              <w:t xml:space="preserve"> hiện chưa trả </w:t>
+              <w:t>evaluation_service.py:199-213</w:t>
+            </w:r>
+            <w:r>
+              <w:t xml:space="preserve"> chỉ gửi "tên: mô tả" của tiêu chí; mốc 0–3, trọng số và ý bắt buộc trong snapshot rubric bị bỏ qua. </w:t>
             </w:r>
             <w:r>
               <w:rPr>
                 <w:rFonts w:ascii="Consolas" w:hAnsi="Consolas"/>
                 <w:color w:val="1B3A6B"/>
               </w:rPr>
-              <w:t>graded</w:t>
-            </w:r>
-            <w:r>
-              <w:t xml:space="preserve"> và </w:t>
+              <w:t>what_good_looks_like</w:t>
+            </w:r>
+            <w:r>
+              <w:t xml:space="preserve"> được sinh nhưng không có cột lưu. </w:t>
             </w:r>
             <w:r>
               <w:rPr>
                 <w:rFonts w:ascii="Consolas" w:hAnsi="Consolas"/>
                 <w:color w:val="1B3A6B"/>
               </w:rPr>
-              <w:t>what_good_looks_like</w:t>
-            </w:r>
-            <w:r>
-              <w:t xml:space="preserve"> cho ứng viên.</w:t>
+              <w:t>GET /evaluation</w:t>
+            </w:r>
+            <w:r>
+              <w:t xml:space="preserve"> không trả </w:t>
+            </w:r>
+            <w:r>
+              <w:rPr>
+                <w:rFonts w:ascii="Consolas" w:hAnsi="Consolas"/>
+                <w:color w:val="1B3A6B"/>
+              </w:rPr>
+              <w:t>graded</w:t>
+            </w:r>
+            <w:r>
+              <w:t>.</w:t>
             </w:r>
           </w:p>
         </w:tc>
@@ -2523,7 +3038,7 @@
               <w:rPr>
                 <w:b/>
               </w:rPr>
-              <w:t>Chưa có trong code — xem RK-1</w:t>
+              <w:t>Chưa có trong code — xem RK-1, mục 7.9</w:t>
             </w:r>
           </w:p>
         </w:tc>
@@ -2547,7 +3062,7 @@
           <w:p>
             <w:r/>
             <w:r>
-              <w:t>Ứng viên chỉ đọc và ghi được phiên, CV và báo cáo của chính mình.</w:t>
+              <w:t>Ứng viên chỉ đọc và ghi được phiên, CV và báo cáo của chính mình. Mọi endpoint nhận id CV, JD hay phiên phải yêu cầu đăng nhập và lọc theo người dùng.</w:t>
             </w:r>
           </w:p>
         </w:tc>
@@ -2558,14 +3073,14 @@
           <w:p>
             <w:r/>
             <w:r>
-              <w:t xml:space="preserve">Hợp đồng SF-03 · Code — </w:t>
+              <w:t xml:space="preserve">Hợp đồng SF-03 · Code — đạt ở </w:t>
             </w:r>
             <w:r>
               <w:rPr>
                 <w:rFonts w:ascii="Consolas" w:hAnsi="Consolas"/>
                 <w:color w:val="1B3A6B"/>
               </w:rPr>
-              <w:t>api/router.py</w:t>
+              <w:t>interviews/api/router.py</w:t>
             </w:r>
             <w:r>
               <w:t xml:space="preserve"> (</w:t>
@@ -2578,7 +3093,96 @@
               <w:t>_owned_session</w:t>
             </w:r>
             <w:r>
-              <w:t>)</w:t>
+              <w:t xml:space="preserve">). </w:t>
+            </w:r>
+            <w:r>
+              <w:rPr>
+                <w:b/>
+              </w:rPr>
+              <w:t>Đang vi phạm</w:t>
+            </w:r>
+            <w:r>
+              <w:t xml:space="preserve"> ở </w:t>
+            </w:r>
+            <w:r>
+              <w:rPr>
+                <w:rFonts w:ascii="Consolas" w:hAnsi="Consolas"/>
+                <w:color w:val="1B3A6B"/>
+              </w:rPr>
+              <w:t>matching/api/router.py</w:t>
+            </w:r>
+            <w:r>
+              <w:t xml:space="preserve">: </w:t>
+            </w:r>
+            <w:r>
+              <w:rPr>
+                <w:rFonts w:ascii="Consolas" w:hAnsi="Consolas"/>
+                <w:color w:val="1B3A6B"/>
+              </w:rPr>
+              <w:t>/match</w:t>
+            </w:r>
+            <w:r>
+              <w:t xml:space="preserve">, </w:t>
+            </w:r>
+            <w:r>
+              <w:rPr>
+                <w:rFonts w:ascii="Consolas" w:hAnsi="Consolas"/>
+                <w:color w:val="1B3A6B"/>
+              </w:rPr>
+              <w:t>/match-ids</w:t>
+            </w:r>
+            <w:r>
+              <w:t xml:space="preserve">, </w:t>
+            </w:r>
+            <w:r>
+              <w:rPr>
+                <w:rFonts w:ascii="Consolas" w:hAnsi="Consolas"/>
+                <w:color w:val="1B3A6B"/>
+              </w:rPr>
+              <w:t>/ai/score-cv-jp</w:t>
+            </w:r>
+            <w:r>
+              <w:t xml:space="preserve">, </w:t>
+            </w:r>
+            <w:r>
+              <w:rPr>
+                <w:rFonts w:ascii="Consolas" w:hAnsi="Consolas"/>
+                <w:color w:val="1B3A6B"/>
+              </w:rPr>
+              <w:t>/clarifications*</w:t>
+            </w:r>
+            <w:r>
+              <w:t xml:space="preserve"> không xác thực, và </w:t>
+            </w:r>
+            <w:r>
+              <w:rPr>
+                <w:rFonts w:ascii="Consolas" w:hAnsi="Consolas"/>
+                <w:color w:val="1B3A6B"/>
+              </w:rPr>
+              <w:t>matching/application/input_resolver.py:25</w:t>
+            </w:r>
+            <w:r>
+              <w:t xml:space="preserve"> đọc </w:t>
+            </w:r>
+            <w:r>
+              <w:rPr>
+                <w:rFonts w:ascii="Consolas" w:hAnsi="Consolas"/>
+                <w:color w:val="1B3A6B"/>
+              </w:rPr>
+              <w:t>user_cvs</w:t>
+            </w:r>
+            <w:r>
+              <w:t xml:space="preserve"> theo id không lọc </w:t>
+            </w:r>
+            <w:r>
+              <w:rPr>
+                <w:rFonts w:ascii="Consolas" w:hAnsi="Consolas"/>
+                <w:color w:val="1B3A6B"/>
+              </w:rPr>
+              <w:t>user_id</w:t>
+            </w:r>
+            <w:r>
+              <w:t>.</w:t>
             </w:r>
           </w:p>
         </w:tc>
@@ -2936,7 +3540,7 @@
           <w:p>
             <w:r/>
             <w:r>
-              <w:t>Câu xác minh CV ở giai đoạn VALIDATE nên hỏi mở về một chi tiết trong CV, không đọc chi tiết đó ra rồi hỏi "đúng không".</w:t>
+              <w:t>Câu hỏi về CV ở giai đoạn VALIDATE nên hỏi mở về một chi tiết trong CV, không đọc chi tiết đó ra rồi hỏi "đúng không". Việc theo dõi ứng viên bảo vệ được những tuyên bố nào trong CV thuộc P-07.</w:t>
             </w:r>
           </w:p>
         </w:tc>
@@ -2947,7 +3551,7 @@
           <w:p>
             <w:r/>
             <w:r>
-              <w:t>Hợp đồng §1.1.6 · Đề xuất</w:t>
+              <w:t>Hợp đồng §1.1.3 · Đề xuất</w:t>
             </w:r>
           </w:p>
         </w:tc>
@@ -3170,7 +3774,7 @@
           <w:p>
             <w:r/>
             <w:r>
-              <w:t xml:space="preserve">Thay thế trường </w:t>
+              <w:t xml:space="preserve">Dùng lại lời gọi đang sinh </w:t>
             </w:r>
             <w:r>
               <w:rPr>
@@ -3180,7 +3784,7 @@
               <w:t>what_good_looks_like</w:t>
             </w:r>
             <w:r>
-              <w:t xml:space="preserve"> hiện tại, không thêm lời gọi mô hình mới. Hoãn phần phân tích video.</w:t>
+              <w:t xml:space="preserve"> (hiện bị bỏ, không lưu), thêm cột lưu và bước kiểm dữ kiện. Hoãn phần phân tích video.</w:t>
             </w:r>
           </w:p>
         </w:tc>
@@ -3526,6 +4130,109 @@
             </w:r>
             <w:r>
               <w:t>). Thêm khoảng 1–2 giây trước khi vào phòng.</w:t>
+            </w:r>
+          </w:p>
+        </w:tc>
+      </w:tr>
+      <w:tr>
+        <w:tc>
+          <w:tcPr>
+            <w:tcW w:type="dxa" w:w="1728"/>
+          </w:tcPr>
+          <w:p>
+            <w:r/>
+            <w:r>
+              <w:t>F-08</w:t>
+            </w:r>
+          </w:p>
+        </w:tc>
+        <w:tc>
+          <w:tcPr>
+            <w:tcW w:type="dxa" w:w="1728"/>
+          </w:tcPr>
+          <w:p>
+            <w:r/>
+            <w:r>
+              <w:rPr>
+                <w:b/>
+              </w:rPr>
+              <w:t>Dán JD của bạn.</w:t>
+            </w:r>
+            <w:r>
+              <w:t xml:space="preserve"> Ứng viên dán hoặc tải JD của công ty mình sắp phỏng vấn; hệ thống bóc tách bằng bộ phân tích JD đã có, gắn vào taxonomy, rồi chọn câu từ ngân hàng theo </w:t>
+            </w:r>
+            <w:r>
+              <w:rPr>
+                <w:rFonts w:ascii="Consolas" w:hAnsi="Consolas"/>
+                <w:color w:val="1B3A6B"/>
+              </w:rPr>
+              <w:t>concept_id</w:t>
+            </w:r>
+            <w:r>
+              <w:t>.</w:t>
+            </w:r>
+          </w:p>
+        </w:tc>
+        <w:tc>
+          <w:tcPr>
+            <w:tcW w:type="dxa" w:w="1728"/>
+          </w:tcPr>
+          <w:p>
+            <w:r/>
+            <w:r>
+              <w:t xml:space="preserve">ChatGPT nhận bất kỳ JD nào; INTERVIA hiện chỉ cho chọn JD do quản trị viên đăng. [Code — frontend </w:t>
+            </w:r>
+            <w:r>
+              <w:rPr>
+                <w:rFonts w:ascii="Consolas" w:hAnsi="Consolas"/>
+                <w:color w:val="1B3A6B"/>
+              </w:rPr>
+              <w:t>UserJobsBoard.tsx</w:t>
+            </w:r>
+            <w:r>
+              <w:t xml:space="preserve"> gọi </w:t>
+            </w:r>
+            <w:r>
+              <w:rPr>
+                <w:rFonts w:ascii="Consolas" w:hAnsi="Consolas"/>
+                <w:color w:val="1B3A6B"/>
+              </w:rPr>
+              <w:t>/admin/job-descriptions</w:t>
+            </w:r>
+            <w:r>
+              <w:t>]</w:t>
+            </w:r>
+          </w:p>
+        </w:tc>
+        <w:tc>
+          <w:tcPr>
+            <w:tcW w:type="dxa" w:w="1728"/>
+          </w:tcPr>
+          <w:p>
+            <w:r/>
+            <w:r>
+              <w:t>JD của ứng viên là riêng tư, không xuất bản cho người khác. Câu hỏi vẫn chỉ lấy từ ngân hàng đã duyệt theo khái niệm; khái niệm không có câu thì báo trước (F-06), không tự sinh câu chưa duyệt cho phiên của ứng viên.</w:t>
+            </w:r>
+          </w:p>
+        </w:tc>
+        <w:tc>
+          <w:tcPr>
+            <w:tcW w:type="dxa" w:w="1728"/>
+          </w:tcPr>
+          <w:p>
+            <w:r/>
+            <w:r>
+              <w:t xml:space="preserve">Bộ phân tích JD trên văn bản thật hiện đạt khoảng 0,53 [Code — </w:t>
+            </w:r>
+            <w:r>
+              <w:rPr>
+                <w:rFonts w:ascii="Consolas" w:hAnsi="Consolas"/>
+                <w:color w:val="1B3A6B"/>
+              </w:rPr>
+              <w:t>reports/</w:t>
+            </w:r>
+            <w:r>
+              <w:t>]; phải cho ứng viên xem và sửa kỹ năng trích ra, giống luồng sửa CV. Hoãn F-05.</w:t>
             </w:r>
           </w:p>
         </w:tc>
@@ -3610,7 +4317,2669 @@
         <w:pStyle w:val="Heading2"/>
       </w:pPr>
       <w:r>
-        <w:t>7.4 Luật trích dẫn bằng chứng cho R-11</w:t>
+        <w:t>7.5 Luận điểm khác biệt so với ChatGPT</w:t>
+      </w:r>
+    </w:p>
+    <w:p>
+      <w:r>
+        <w:t xml:space="preserve">ChatGPT nhận CV và JD được dán vào, hỏi từng câu, hỏi đào sâu, chạy bằng giọng nói và chấm điểm khi được yêu cầu. Những thứ đó </w:t>
+      </w:r>
+      <w:r>
+        <w:rPr>
+          <w:b/>
+        </w:rPr>
+        <w:t>không</w:t>
+      </w:r>
+      <w:r>
+        <w:t xml:space="preserve"> phải khác biệt của INTERVIA. Bảng điều khiển tiến bộ nói chung cũng không phải: Exponent, Yoodli (bản doanh nghiệp) và Interview Prep Academy đã có. [Khảo sát — tryexponent.com, yoodli.ai, producthunt.com]</w:t>
+      </w:r>
+    </w:p>
+    <w:p>
+      <w:r>
+        <w:t>Khác biệt chỉ đứng được ở những chỗ một cuộc chat không trạng thái về cấu trúc không làm được:</w:t>
+      </w:r>
+    </w:p>
+    <w:tbl>
+      <w:tblPr>
+        <w:tblStyle w:val="TableGrid"/>
+        <w:tblW w:type="auto" w:w="0"/>
+        <w:tblLook w:firstColumn="1" w:firstRow="1" w:lastColumn="0" w:lastRow="0" w:noHBand="0" w:noVBand="1" w:val="04A0"/>
+      </w:tblPr>
+      <w:tblGrid>
+        <w:gridCol w:w="2160"/>
+        <w:gridCol w:w="2160"/>
+        <w:gridCol w:w="2160"/>
+        <w:gridCol w:w="2160"/>
+      </w:tblGrid>
+      <w:tr>
+        <w:tc>
+          <w:tcPr>
+            <w:tcW w:type="dxa" w:w="2160"/>
+            <w:shd w:val="clear" w:color="auto" w:fill="E9EDF4"/>
+          </w:tcPr>
+          <w:p>
+            <w:r>
+              <w:rPr>
+                <w:b/>
+              </w:rPr>
+            </w:r>
+            <w:r>
+              <w:rPr>
+                <w:b/>
+              </w:rPr>
+              <w:t>ID</w:t>
+            </w:r>
+          </w:p>
+        </w:tc>
+        <w:tc>
+          <w:tcPr>
+            <w:tcW w:type="dxa" w:w="2160"/>
+            <w:shd w:val="clear" w:color="auto" w:fill="E9EDF4"/>
+          </w:tcPr>
+          <w:p>
+            <w:r>
+              <w:rPr>
+                <w:b/>
+              </w:rPr>
+            </w:r>
+            <w:r>
+              <w:rPr>
+                <w:b/>
+              </w:rPr>
+              <w:t>Khác biệt</w:t>
+            </w:r>
+          </w:p>
+        </w:tc>
+        <w:tc>
+          <w:tcPr>
+            <w:tcW w:type="dxa" w:w="2160"/>
+            <w:shd w:val="clear" w:color="auto" w:fill="E9EDF4"/>
+          </w:tcPr>
+          <w:p>
+            <w:r>
+              <w:rPr>
+                <w:b/>
+              </w:rPr>
+            </w:r>
+            <w:r>
+              <w:rPr>
+                <w:b/>
+              </w:rPr>
+              <w:t>Vì sao chat chung không làm được</w:t>
+            </w:r>
+          </w:p>
+        </w:tc>
+        <w:tc>
+          <w:tcPr>
+            <w:tcW w:type="dxa" w:w="2160"/>
+            <w:shd w:val="clear" w:color="auto" w:fill="E9EDF4"/>
+          </w:tcPr>
+          <w:p>
+            <w:r>
+              <w:rPr>
+                <w:b/>
+              </w:rPr>
+            </w:r>
+            <w:r>
+              <w:rPr>
+                <w:b/>
+              </w:rPr>
+              <w:t>Hiện tại</w:t>
+            </w:r>
+          </w:p>
+        </w:tc>
+      </w:tr>
+      <w:tr>
+        <w:tc>
+          <w:tcPr>
+            <w:tcW w:type="dxa" w:w="2160"/>
+          </w:tcPr>
+          <w:p>
+            <w:r/>
+            <w:r>
+              <w:t>D-1</w:t>
+            </w:r>
+          </w:p>
+        </w:tc>
+        <w:tc>
+          <w:tcPr>
+            <w:tcW w:type="dxa" w:w="2160"/>
+          </w:tcPr>
+          <w:p>
+            <w:r/>
+            <w:r>
+              <w:rPr>
+                <w:b/>
+              </w:rPr>
+              <w:t>Điểm có sai số được công bố.</w:t>
+            </w:r>
+            <w:r>
+              <w:t xml:space="preserve"> Cùng câu trả lời, cùng rubric phiên bản, điểm nằm trong biên sai số đã đo.</w:t>
+            </w:r>
+          </w:p>
+        </w:tc>
+        <w:tc>
+          <w:tcPr>
+            <w:tcW w:type="dxa" w:w="2160"/>
+          </w:tcPr>
+          <w:p>
+            <w:r/>
+            <w:r>
+              <w:t>Mỗi cuộc chat chấm theo một tiêu chuẩn ngầm khác nhau; không có rubric cố định để đo sai số.</w:t>
+            </w:r>
+          </w:p>
+        </w:tc>
+        <w:tc>
+          <w:tcPr>
+            <w:tcW w:type="dxa" w:w="2160"/>
+          </w:tcPr>
+          <w:p>
+            <w:r/>
+            <w:r>
+              <w:t>Chưa</w:t>
+            </w:r>
+          </w:p>
+        </w:tc>
+      </w:tr>
+      <w:tr>
+        <w:tc>
+          <w:tcPr>
+            <w:tcW w:type="dxa" w:w="2160"/>
+          </w:tcPr>
+          <w:p>
+            <w:r/>
+            <w:r>
+              <w:t>D-2</w:t>
+            </w:r>
+          </w:p>
+        </w:tc>
+        <w:tc>
+          <w:tcPr>
+            <w:tcW w:type="dxa" w:w="2160"/>
+          </w:tcPr>
+          <w:p>
+            <w:r/>
+            <w:r>
+              <w:rPr>
+                <w:b/>
+              </w:rPr>
+              <w:t>Tiến bộ đo được.</w:t>
+            </w:r>
+            <w:r>
+              <w:t xml:space="preserve"> Sổ kỹ năng theo </w:t>
+            </w:r>
+            <w:r>
+              <w:rPr>
+                <w:rFonts w:ascii="Consolas" w:hAnsi="Consolas"/>
+                <w:color w:val="1B3A6B"/>
+              </w:rPr>
+              <w:t>concept_id</w:t>
+            </w:r>
+            <w:r>
+              <w:t>, khoảng tin cậy, chỉ báo "tiến bộ thật" chỉ khi vượt ngưỡng nhiễu.</w:t>
+            </w:r>
+          </w:p>
+        </w:tc>
+        <w:tc>
+          <w:tcPr>
+            <w:tcW w:type="dxa" w:w="2160"/>
+          </w:tcPr>
+          <w:p>
+            <w:r/>
+            <w:r>
+              <w:t>Trí nhớ của chat là văn bản tự do, không phải chuỗi đo theo kỹ năng.</w:t>
+            </w:r>
+          </w:p>
+        </w:tc>
+        <w:tc>
+          <w:tcPr>
+            <w:tcW w:type="dxa" w:w="2160"/>
+          </w:tcPr>
+          <w:p>
+            <w:r/>
+            <w:r>
+              <w:t>Chưa</w:t>
+            </w:r>
+          </w:p>
+        </w:tc>
+      </w:tr>
+      <w:tr>
+        <w:tc>
+          <w:tcPr>
+            <w:tcW w:type="dxa" w:w="2160"/>
+          </w:tcPr>
+          <w:p>
+            <w:r/>
+            <w:r>
+              <w:t>D-3</w:t>
+            </w:r>
+          </w:p>
+        </w:tc>
+        <w:tc>
+          <w:tcPr>
+            <w:tcW w:type="dxa" w:w="2160"/>
+          </w:tcPr>
+          <w:p>
+            <w:r/>
+            <w:r>
+              <w:rPr>
+                <w:b/>
+              </w:rPr>
+              <w:t>Câu neo do người duyệt.</w:t>
+            </w:r>
+            <w:r>
+              <w:t xml:space="preserve"> Mỗi kỹ năng có câu đã duyệt được hỏi lại định kỳ để so sánh cùng điều kiện.</w:t>
+            </w:r>
+          </w:p>
+        </w:tc>
+        <w:tc>
+          <w:tcPr>
+            <w:tcW w:type="dxa" w:w="2160"/>
+          </w:tcPr>
+          <w:p>
+            <w:r/>
+            <w:r>
+              <w:t>Mô hình nghĩ câu mới mỗi lần; hai lần đo không cùng đề.</w:t>
+            </w:r>
+          </w:p>
+        </w:tc>
+        <w:tc>
+          <w:tcPr>
+            <w:tcW w:type="dxa" w:w="2160"/>
+          </w:tcPr>
+          <w:p>
+            <w:r/>
+            <w:r>
+              <w:t>Một phần (có xoay vòng câu, chưa có câu neo)</w:t>
+            </w:r>
+          </w:p>
+        </w:tc>
+      </w:tr>
+      <w:tr>
+        <w:tc>
+          <w:tcPr>
+            <w:tcW w:type="dxa" w:w="2160"/>
+          </w:tcPr>
+          <w:p>
+            <w:r/>
+            <w:r>
+              <w:t>D-4</w:t>
+            </w:r>
+          </w:p>
+        </w:tc>
+        <w:tc>
+          <w:tcPr>
+            <w:tcW w:type="dxa" w:w="2160"/>
+          </w:tcPr>
+          <w:p>
+            <w:r/>
+            <w:r>
+              <w:rPr>
+                <w:b/>
+              </w:rPr>
+              <w:t>Phòng thủ CV.</w:t>
+            </w:r>
+            <w:r>
+              <w:t xml:space="preserve"> Mỗi dự án, con số, công nghệ trong CV là một mục cần bảo vệ; theo dõi mục nào đã được trả lời vững khi bị hỏi đào sâu.</w:t>
+            </w:r>
+          </w:p>
+        </w:tc>
+        <w:tc>
+          <w:tcPr>
+            <w:tcW w:type="dxa" w:w="2160"/>
+          </w:tcPr>
+          <w:p>
+            <w:r/>
+            <w:r>
+              <w:t>Chat không giữ danh sách tuyên bố của CV và trạng thái từng tuyên bố qua các buổi.</w:t>
+            </w:r>
+          </w:p>
+        </w:tc>
+        <w:tc>
+          <w:tcPr>
+            <w:tcW w:type="dxa" w:w="2160"/>
+          </w:tcPr>
+          <w:p>
+            <w:r/>
+            <w:r>
+              <w:t>Chưa</w:t>
+            </w:r>
+          </w:p>
+        </w:tc>
+      </w:tr>
+      <w:tr>
+        <w:tc>
+          <w:tcPr>
+            <w:tcW w:type="dxa" w:w="2160"/>
+          </w:tcPr>
+          <w:p>
+            <w:r/>
+            <w:r>
+              <w:t>D-5</w:t>
+            </w:r>
+          </w:p>
+        </w:tc>
+        <w:tc>
+          <w:tcPr>
+            <w:tcW w:type="dxa" w:w="2160"/>
+          </w:tcPr>
+          <w:p>
+            <w:r/>
+            <w:r>
+              <w:rPr>
+                <w:b/>
+              </w:rPr>
+              <w:t>Vòng khép kín.</w:t>
+            </w:r>
+            <w:r>
+              <w:t xml:space="preserve"> Khoảng trống JD → bài luyện → đo lại → cập nhật sổ kỹ năng → mức sẵn sàng theo JD.</w:t>
+            </w:r>
+          </w:p>
+        </w:tc>
+        <w:tc>
+          <w:tcPr>
+            <w:tcW w:type="dxa" w:w="2160"/>
+          </w:tcPr>
+          <w:p>
+            <w:r/>
+            <w:r>
+              <w:t>Người dùng phải tự nhớ và tự lên kế hoạch.</w:t>
+            </w:r>
+          </w:p>
+        </w:tc>
+        <w:tc>
+          <w:tcPr>
+            <w:tcW w:type="dxa" w:w="2160"/>
+          </w:tcPr>
+          <w:p>
+            <w:r/>
+            <w:r>
+              <w:t>Chưa</w:t>
+            </w:r>
+          </w:p>
+        </w:tc>
+      </w:tr>
+      <w:tr>
+        <w:tc>
+          <w:tcPr>
+            <w:tcW w:type="dxa" w:w="2160"/>
+          </w:tcPr>
+          <w:p>
+            <w:r/>
+            <w:r>
+              <w:t>D-6</w:t>
+            </w:r>
+          </w:p>
+        </w:tc>
+        <w:tc>
+          <w:tcPr>
+            <w:tcW w:type="dxa" w:w="2160"/>
+          </w:tcPr>
+          <w:p>
+            <w:r/>
+            <w:r>
+              <w:rPr>
+                <w:b/>
+              </w:rPr>
+              <w:t>Bảo đảm cứng bằng code.</w:t>
+            </w:r>
+            <w:r>
+              <w:t xml:space="preserve"> Không bịa trích dẫn, không hỏi câu phân biệt đối xử, không ghi hoàn thành sai.</w:t>
+            </w:r>
+          </w:p>
+        </w:tc>
+        <w:tc>
+          <w:tcPr>
+            <w:tcW w:type="dxa" w:w="2160"/>
+          </w:tcPr>
+          <w:p>
+            <w:r/>
+            <w:r>
+              <w:t>Chỉ dựa vào lời dặn trong prompt.</w:t>
+            </w:r>
+          </w:p>
+        </w:tc>
+        <w:tc>
+          <w:tcPr>
+            <w:tcW w:type="dxa" w:w="2160"/>
+          </w:tcPr>
+          <w:p>
+            <w:r/>
+            <w:r>
+              <w:t>Một phần</w:t>
+            </w:r>
+          </w:p>
+        </w:tc>
+      </w:tr>
+    </w:tbl>
+    <w:p/>
+    <w:p>
+      <w:r>
+        <w:rPr>
+          <w:b/>
+        </w:rPr>
+        <w:t>Luận điểm:</w:t>
+      </w:r>
+      <w:r>
+        <w:t xml:space="preserve"> </w:t>
+      </w:r>
+      <w:r>
+        <w:rPr>
+          <w:i/>
+        </w:rPr>
+        <w:t>Tiến bộ đo được, không phải cảm giác.</w:t>
+      </w:r>
+      <w:r>
+        <w:t xml:space="preserve"> INTERVIA đo sai số chấm của chính mình và chỉ nói "bạn đã tiến bộ" khi thay đổi lớn hơn sai số đó. Trong phạm vi khảo sát, chưa thấy sản phẩm luyện phỏng vấn nào công bố sai số chấm cho người dùng. [Khảo sát — tìm kiếm ngày 09/10/2026; chưa phải khảo sát toàn diện]</w:t>
+      </w:r>
+    </w:p>
+    <w:p>
+      <w:pPr>
+        <w:pStyle w:val="Heading2"/>
+      </w:pPr>
+      <w:r>
+        <w:t>7.6 Hồ sơ tiến bộ</w:t>
+      </w:r>
+    </w:p>
+    <w:p>
+      <w:r>
+        <w:t>P-01, P-03, P-04 và P-12 hiện thực hóa điều khoản MUST của Hợp đồng §1.4 nên mang nhãn [Hợp đồng]; các P còn lại là [Đề xuất]. Tất cả chịu ràng buộc của SF-07. Thứ tự P0 → P2 là thứ tự phải làm: các màn hình ở P2 vô nghĩa nếu nền đo ở P0 sai.</w:t>
+      </w:r>
+    </w:p>
+    <w:tbl>
+      <w:tblPr>
+        <w:tblStyle w:val="TableGrid"/>
+        <w:tblW w:type="auto" w:w="0"/>
+        <w:tblLook w:firstColumn="1" w:firstRow="1" w:lastColumn="0" w:lastRow="0" w:noHBand="0" w:noVBand="1" w:val="04A0"/>
+      </w:tblPr>
+      <w:tblGrid>
+        <w:gridCol w:w="2160"/>
+        <w:gridCol w:w="2160"/>
+        <w:gridCol w:w="2160"/>
+        <w:gridCol w:w="2160"/>
+      </w:tblGrid>
+      <w:tr>
+        <w:tc>
+          <w:tcPr>
+            <w:tcW w:type="dxa" w:w="2160"/>
+            <w:shd w:val="clear" w:color="auto" w:fill="E9EDF4"/>
+          </w:tcPr>
+          <w:p>
+            <w:r>
+              <w:rPr>
+                <w:b/>
+              </w:rPr>
+            </w:r>
+            <w:r>
+              <w:rPr>
+                <w:b/>
+              </w:rPr>
+              <w:t>ID</w:t>
+            </w:r>
+          </w:p>
+        </w:tc>
+        <w:tc>
+          <w:tcPr>
+            <w:tcW w:type="dxa" w:w="2160"/>
+            <w:shd w:val="clear" w:color="auto" w:fill="E9EDF4"/>
+          </w:tcPr>
+          <w:p>
+            <w:r>
+              <w:rPr>
+                <w:b/>
+              </w:rPr>
+            </w:r>
+            <w:r>
+              <w:rPr>
+                <w:b/>
+              </w:rPr>
+              <w:t>Ưu tiên</w:t>
+            </w:r>
+          </w:p>
+        </w:tc>
+        <w:tc>
+          <w:tcPr>
+            <w:tcW w:type="dxa" w:w="2160"/>
+            <w:shd w:val="clear" w:color="auto" w:fill="E9EDF4"/>
+          </w:tcPr>
+          <w:p>
+            <w:r>
+              <w:rPr>
+                <w:b/>
+              </w:rPr>
+            </w:r>
+            <w:r>
+              <w:rPr>
+                <w:b/>
+              </w:rPr>
+              <w:t>Yêu cầu</w:t>
+            </w:r>
+          </w:p>
+        </w:tc>
+        <w:tc>
+          <w:tcPr>
+            <w:tcW w:type="dxa" w:w="2160"/>
+            <w:shd w:val="clear" w:color="auto" w:fill="E9EDF4"/>
+          </w:tcPr>
+          <w:p>
+            <w:r>
+              <w:rPr>
+                <w:b/>
+              </w:rPr>
+            </w:r>
+            <w:r>
+              <w:rPr>
+                <w:b/>
+              </w:rPr>
+              <w:t>Nguồn</w:t>
+            </w:r>
+          </w:p>
+        </w:tc>
+      </w:tr>
+      <w:tr>
+        <w:tc>
+          <w:tcPr>
+            <w:tcW w:type="dxa" w:w="2160"/>
+          </w:tcPr>
+          <w:p>
+            <w:r/>
+            <w:r>
+              <w:t>P-12</w:t>
+            </w:r>
+          </w:p>
+        </w:tc>
+        <w:tc>
+          <w:tcPr>
+            <w:tcW w:type="dxa" w:w="2160"/>
+          </w:tcPr>
+          <w:p>
+            <w:r/>
+            <w:r>
+              <w:t>P0</w:t>
+            </w:r>
+          </w:p>
+        </w:tc>
+        <w:tc>
+          <w:tcPr>
+            <w:tcW w:type="dxa" w:w="2160"/>
+          </w:tcPr>
+          <w:p>
+            <w:r/>
+            <w:r>
+              <w:rPr>
+                <w:b/>
+              </w:rPr>
+              <w:t>Không bao giờ mất lịch sử.</w:t>
+            </w:r>
+            <w:r>
+              <w:t xml:space="preserve"> Xóa CV không được ẩn hay xóa phiên và báo cáo cũ. Bỏ điều kiện </w:t>
+            </w:r>
+            <w:r>
+              <w:rPr>
+                <w:rFonts w:ascii="Consolas" w:hAnsi="Consolas"/>
+                <w:color w:val="1B3A6B"/>
+              </w:rPr>
+              <w:t>resume_id IS NOT NULL</w:t>
+            </w:r>
+            <w:r>
+              <w:t xml:space="preserve"> khi liệt kê và đọc phiên; phiên giữ snapshot đủ để hiển thị báo cáo khi CV đã xóa.</w:t>
+            </w:r>
+          </w:p>
+        </w:tc>
+        <w:tc>
+          <w:tcPr>
+            <w:tcW w:type="dxa" w:w="2160"/>
+          </w:tcPr>
+          <w:p>
+            <w:r/>
+            <w:r>
+              <w:t xml:space="preserve">Hợp đồng §1.4.6 · Code — </w:t>
+            </w:r>
+            <w:r>
+              <w:rPr>
+                <w:rFonts w:ascii="Consolas" w:hAnsi="Consolas"/>
+                <w:color w:val="1B3A6B"/>
+              </w:rPr>
+              <w:t>migrations/versions/20260925_0013_interview_runtime_foundation.py:30</w:t>
+            </w:r>
+            <w:r>
+              <w:t xml:space="preserve"> (</w:t>
+            </w:r>
+            <w:r>
+              <w:rPr>
+                <w:rFonts w:ascii="Consolas" w:hAnsi="Consolas"/>
+                <w:color w:val="1B3A6B"/>
+              </w:rPr>
+              <w:t>ON DELETE SET NULL</w:t>
+            </w:r>
+            <w:r>
+              <w:t xml:space="preserve">), </w:t>
+            </w:r>
+            <w:r>
+              <w:rPr>
+                <w:rFonts w:ascii="Consolas" w:hAnsi="Consolas"/>
+                <w:color w:val="1B3A6B"/>
+              </w:rPr>
+              <w:t>api/router.py:182, 332</w:t>
+            </w:r>
+          </w:p>
+        </w:tc>
+      </w:tr>
+      <w:tr>
+        <w:tc>
+          <w:tcPr>
+            <w:tcW w:type="dxa" w:w="2160"/>
+          </w:tcPr>
+          <w:p>
+            <w:r/>
+            <w:r>
+              <w:t>P-01</w:t>
+            </w:r>
+          </w:p>
+        </w:tc>
+        <w:tc>
+          <w:tcPr>
+            <w:tcW w:type="dxa" w:w="2160"/>
+          </w:tcPr>
+          <w:p>
+            <w:r/>
+            <w:r>
+              <w:t>P0</w:t>
+            </w:r>
+          </w:p>
+        </w:tc>
+        <w:tc>
+          <w:tcPr>
+            <w:tcW w:type="dxa" w:w="2160"/>
+          </w:tcPr>
+          <w:p>
+            <w:r/>
+            <w:r>
+              <w:rPr>
+                <w:b/>
+              </w:rPr>
+              <w:t>Sổ kỹ năng theo `concept_id`.</w:t>
+            </w:r>
+            <w:r>
+              <w:t xml:space="preserve"> Mỗi lượt đã chấm sinh một quan sát gắn </w:t>
+            </w:r>
+            <w:r>
+              <w:rPr>
+                <w:rFonts w:ascii="Consolas" w:hAnsi="Consolas"/>
+                <w:color w:val="1B3A6B"/>
+              </w:rPr>
+              <w:t>concept_id</w:t>
+            </w:r>
+            <w:r>
+              <w:t xml:space="preserve">, </w:t>
+            </w:r>
+            <w:r>
+              <w:rPr>
+                <w:rFonts w:ascii="Consolas" w:hAnsi="Consolas"/>
+                <w:color w:val="1B3A6B"/>
+              </w:rPr>
+              <w:t>taxonomy_version</w:t>
+            </w:r>
+            <w:r>
+              <w:t xml:space="preserve">, </w:t>
+            </w:r>
+            <w:r>
+              <w:rPr>
+                <w:rFonts w:ascii="Consolas" w:hAnsi="Consolas"/>
+                <w:color w:val="1B3A6B"/>
+              </w:rPr>
+              <w:t>question_version_id</w:t>
+            </w:r>
+            <w:r>
+              <w:t xml:space="preserve">, </w:t>
+            </w:r>
+            <w:r>
+              <w:rPr>
+                <w:rFonts w:ascii="Consolas" w:hAnsi="Consolas"/>
+                <w:color w:val="1B3A6B"/>
+              </w:rPr>
+              <w:t>rubric_version_id</w:t>
+            </w:r>
+            <w:r>
+              <w:t xml:space="preserve">, </w:t>
+            </w:r>
+            <w:r>
+              <w:rPr>
+                <w:rFonts w:ascii="Consolas" w:hAnsi="Consolas"/>
+                <w:color w:val="1B3A6B"/>
+              </w:rPr>
+              <w:t>scorer_version</w:t>
+            </w:r>
+            <w:r>
+              <w:t xml:space="preserve">. Điểm năng lực không được tổng hợp theo nhãn chữ. Lượt thay thế (câu kỹ năng rộng hơn hoặc câu theo vai trò) ghi khái niệm thực sự được hỏi, không phải khái niệm mục tiêu. Loại khỏi sổ: lượt </w:t>
+            </w:r>
+            <w:r>
+              <w:rPr>
+                <w:rFonts w:ascii="Consolas" w:hAnsi="Consolas"/>
+                <w:color w:val="1B3A6B"/>
+              </w:rPr>
+              <w:t>graded = false</w:t>
+            </w:r>
+            <w:r>
+              <w:t xml:space="preserve">, các id giả </w:t>
+            </w:r>
+            <w:r>
+              <w:rPr>
+                <w:rFonts w:ascii="Consolas" w:hAnsi="Consolas"/>
+                <w:color w:val="1B3A6B"/>
+              </w:rPr>
+              <w:t>warmup</w:t>
+            </w:r>
+            <w:r>
+              <w:t xml:space="preserve"> và </w:t>
+            </w:r>
+            <w:r>
+              <w:rPr>
+                <w:rFonts w:ascii="Consolas" w:hAnsi="Consolas"/>
+                <w:color w:val="1B3A6B"/>
+              </w:rPr>
+              <w:t>cv-validation</w:t>
+            </w:r>
+            <w:r>
+              <w:t xml:space="preserve">, phiên </w:t>
+            </w:r>
+            <w:r>
+              <w:rPr>
+                <w:rFonts w:ascii="Consolas" w:hAnsi="Consolas"/>
+                <w:color w:val="1B3A6B"/>
+              </w:rPr>
+              <w:t>TECHNICAL_FAILURE</w:t>
+            </w:r>
+            <w:r>
+              <w:t>, phiên khởi động F-07.</w:t>
+            </w:r>
+          </w:p>
+        </w:tc>
+        <w:tc>
+          <w:tcPr>
+            <w:tcW w:type="dxa" w:w="2160"/>
+          </w:tcPr>
+          <w:p>
+            <w:r/>
+            <w:r>
+              <w:t xml:space="preserve">Hợp đồng §1.4.1 · Code — </w:t>
+            </w:r>
+            <w:r>
+              <w:rPr>
+                <w:rFonts w:ascii="Consolas" w:hAnsi="Consolas"/>
+                <w:color w:val="1B3A6B"/>
+              </w:rPr>
+              <w:t>competency_scores</w:t>
+            </w:r>
+            <w:r>
+              <w:t xml:space="preserve"> hiện lưu theo nhãn tự do; </w:t>
+            </w:r>
+            <w:r>
+              <w:rPr>
+                <w:rFonts w:ascii="Consolas" w:hAnsi="Consolas"/>
+                <w:color w:val="1B3A6B"/>
+              </w:rPr>
+              <w:t>concept_id</w:t>
+            </w:r>
+            <w:r>
+              <w:t xml:space="preserve"> có trong </w:t>
+            </w:r>
+            <w:r>
+              <w:rPr>
+                <w:rFonts w:ascii="Consolas" w:hAnsi="Consolas"/>
+                <w:color w:val="1B3A6B"/>
+              </w:rPr>
+              <w:t>question_snapshot.taxonomyTarget</w:t>
+            </w:r>
+          </w:p>
+        </w:tc>
+      </w:tr>
+      <w:tr>
+        <w:tc>
+          <w:tcPr>
+            <w:tcW w:type="dxa" w:w="2160"/>
+          </w:tcPr>
+          <w:p>
+            <w:r/>
+            <w:r>
+              <w:t>P-02</w:t>
+            </w:r>
+          </w:p>
+        </w:tc>
+        <w:tc>
+          <w:tcPr>
+            <w:tcW w:type="dxa" w:w="2160"/>
+          </w:tcPr>
+          <w:p>
+            <w:r/>
+            <w:r>
+              <w:t>P0</w:t>
+            </w:r>
+          </w:p>
+        </w:tc>
+        <w:tc>
+          <w:tcPr>
+            <w:tcW w:type="dxa" w:w="2160"/>
+          </w:tcPr>
+          <w:p>
+            <w:r/>
+            <w:r>
+              <w:rPr>
+                <w:b/>
+              </w:rPr>
+              <w:t>Chấm theo mốc rubric.</w:t>
+            </w:r>
+            <w:r>
+              <w:t xml:space="preserve"> Mô hình chấm chọn mức 0–3 cho từng tiêu chí, kèm trích dẫn cho mức đó; điểm lượt được tính bằng code từ mức × trọng số, không để mô hình tự cho một số 0–10.</w:t>
+            </w:r>
+          </w:p>
+        </w:tc>
+        <w:tc>
+          <w:tcPr>
+            <w:tcW w:type="dxa" w:w="2160"/>
+          </w:tcPr>
+          <w:p>
+            <w:r/>
+            <w:r>
+              <w:t>Hợp đồng §1.1.10 · Code — mốc và trọng số đã có trong snapshot nhưng không được dùng</w:t>
+            </w:r>
+          </w:p>
+        </w:tc>
+      </w:tr>
+      <w:tr>
+        <w:tc>
+          <w:tcPr>
+            <w:tcW w:type="dxa" w:w="2160"/>
+          </w:tcPr>
+          <w:p>
+            <w:r/>
+            <w:r>
+              <w:t>P-03</w:t>
+            </w:r>
+          </w:p>
+        </w:tc>
+        <w:tc>
+          <w:tcPr>
+            <w:tcW w:type="dxa" w:w="2160"/>
+          </w:tcPr>
+          <w:p>
+            <w:r/>
+            <w:r>
+              <w:t>P0</w:t>
+            </w:r>
+          </w:p>
+        </w:tc>
+        <w:tc>
+          <w:tcPr>
+            <w:tcW w:type="dxa" w:w="2160"/>
+          </w:tcPr>
+          <w:p>
+            <w:r/>
+            <w:r>
+              <w:rPr>
+                <w:b/>
+              </w:rPr>
+              <w:t>Ngưỡng nhiễu.</w:t>
+            </w:r>
+            <w:r>
+              <w:t xml:space="preserve"> Bộ hiệu chuẩn gồm các câu trả lời cố định, chấm lại k lần (k = 5) mỗi khi đổi mô hình, prompt hoặc rubric. Tính sai số chuẩn đo lường (SEM) theo khái niệm và ngưỡng thay đổi tối thiểu MDC95 = 1,96 × √2 × SEM. Khoảng tin cậy 95% quanh </w:t>
+            </w:r>
+            <w:r>
+              <w:rPr>
+                <w:b/>
+              </w:rPr>
+              <w:t>một</w:t>
+            </w:r>
+            <w:r>
+              <w:t xml:space="preserve"> điểm là ±1,96 × SEM (= MDC95 / √2); MDC95 là ngưỡng cho </w:t>
+            </w:r>
+            <w:r>
+              <w:rPr>
+                <w:b/>
+              </w:rPr>
+              <w:t>hiệu</w:t>
+            </w:r>
+            <w:r>
+              <w:t xml:space="preserve"> hai điểm. SEM đo bằng cách chấm lại cùng câu trả lời chỉ phản ánh dao động của bộ chấm, nên là </w:t>
+            </w:r>
+            <w:r>
+              <w:rPr>
+                <w:b/>
+              </w:rPr>
+              <w:t>cận dưới</w:t>
+            </w:r>
+            <w:r>
+              <w:t xml:space="preserve">: giữa hai buổi còn có độ khó câu hỏi và phong độ của ứng viên. Giá trị: </w:t>
+            </w:r>
+            <w:r>
+              <w:rPr>
+                <w:i/>
+              </w:rPr>
+              <w:t>Chờ đo</w:t>
+            </w:r>
+            <w:r>
+              <w:t>.</w:t>
+            </w:r>
+          </w:p>
+        </w:tc>
+        <w:tc>
+          <w:tcPr>
+            <w:tcW w:type="dxa" w:w="2160"/>
+          </w:tcPr>
+          <w:p>
+            <w:r/>
+            <w:r>
+              <w:t>Hợp đồng §1.4.2 · Khảo sát — arXiv 2506.22316, 2603.04417</w:t>
+            </w:r>
+          </w:p>
+        </w:tc>
+      </w:tr>
+      <w:tr>
+        <w:tc>
+          <w:tcPr>
+            <w:tcW w:type="dxa" w:w="2160"/>
+          </w:tcPr>
+          <w:p>
+            <w:r/>
+            <w:r>
+              <w:t>P-13</w:t>
+            </w:r>
+          </w:p>
+        </w:tc>
+        <w:tc>
+          <w:tcPr>
+            <w:tcW w:type="dxa" w:w="2160"/>
+          </w:tcPr>
+          <w:p>
+            <w:r/>
+            <w:r>
+              <w:t>P0</w:t>
+            </w:r>
+          </w:p>
+        </w:tc>
+        <w:tc>
+          <w:tcPr>
+            <w:tcW w:type="dxa" w:w="2160"/>
+          </w:tcPr>
+          <w:p>
+            <w:r/>
+            <w:r>
+              <w:rPr>
+                <w:b/>
+              </w:rPr>
+              <w:t>Trạng thái rỗng trung thực.</w:t>
+            </w:r>
+            <w:r>
+              <w:t xml:space="preserve"> Người mới chưa có buổi nào thấy cách hệ thống đo (sai số, câu neo) và nút bắt đầu buổi đầu tiên; không hiển thị số giả hay "—" vĩnh viễn. "Thời gian luyện tập" tính từ </w:t>
+            </w:r>
+            <w:r>
+              <w:rPr>
+                <w:rFonts w:ascii="Consolas" w:hAnsi="Consolas"/>
+                <w:color w:val="1B3A6B"/>
+              </w:rPr>
+              <w:t>startedAt</w:t>
+            </w:r>
+            <w:r>
+              <w:t xml:space="preserve"> và </w:t>
+            </w:r>
+            <w:r>
+              <w:rPr>
+                <w:rFonts w:ascii="Consolas" w:hAnsi="Consolas"/>
+                <w:color w:val="1B3A6B"/>
+              </w:rPr>
+              <w:t>endedAt</w:t>
+            </w:r>
+            <w:r>
+              <w:t xml:space="preserve"> đã có.</w:t>
+            </w:r>
+          </w:p>
+        </w:tc>
+        <w:tc>
+          <w:tcPr>
+            <w:tcW w:type="dxa" w:w="2160"/>
+          </w:tcPr>
+          <w:p>
+            <w:r/>
+            <w:r>
+              <w:t xml:space="preserve">Code — frontend </w:t>
+            </w:r>
+            <w:r>
+              <w:rPr>
+                <w:rFonts w:ascii="Consolas" w:hAnsi="Consolas"/>
+                <w:color w:val="1B3A6B"/>
+              </w:rPr>
+              <w:t>UserDashboardHome.tsx</w:t>
+            </w:r>
+            <w:r>
+              <w:t xml:space="preserve">; </w:t>
+            </w:r>
+            <w:r>
+              <w:rPr>
+                <w:rFonts w:ascii="Consolas" w:hAnsi="Consolas"/>
+                <w:color w:val="1B3A6B"/>
+              </w:rPr>
+              <w:t>ProgressPreview.tsx</w:t>
+            </w:r>
+            <w:r>
+              <w:t xml:space="preserve"> có sẵn nhưng chưa dùng</w:t>
+            </w:r>
+          </w:p>
+        </w:tc>
+      </w:tr>
+      <w:tr>
+        <w:tc>
+          <w:tcPr>
+            <w:tcW w:type="dxa" w:w="2160"/>
+          </w:tcPr>
+          <w:p>
+            <w:r/>
+            <w:r>
+              <w:t>P-04</w:t>
+            </w:r>
+          </w:p>
+        </w:tc>
+        <w:tc>
+          <w:tcPr>
+            <w:tcW w:type="dxa" w:w="2160"/>
+          </w:tcPr>
+          <w:p>
+            <w:r/>
+            <w:r>
+              <w:t>P1</w:t>
+            </w:r>
+          </w:p>
+        </w:tc>
+        <w:tc>
+          <w:tcPr>
+            <w:tcW w:type="dxa" w:w="2160"/>
+          </w:tcPr>
+          <w:p>
+            <w:r/>
+            <w:r>
+              <w:rPr>
+                <w:b/>
+              </w:rPr>
+              <w:t>Chỉ báo tiến bộ ba mức</w:t>
+            </w:r>
+            <w:r>
+              <w:t xml:space="preserve"> cho mỗi khái niệm: </w:t>
+            </w:r>
+            <w:r>
+              <w:rPr>
+                <w:b/>
+              </w:rPr>
+              <w:t>TIẾN BỘ THẬT</w:t>
+            </w:r>
+            <w:r>
+              <w:t xml:space="preserve">, </w:t>
+            </w:r>
+            <w:r>
+              <w:rPr>
+                <w:b/>
+              </w:rPr>
+              <w:t>TRONG BIÊN NHIỄU</w:t>
+            </w:r>
+            <w:r>
+              <w:t xml:space="preserve">, </w:t>
+            </w:r>
+            <w:r>
+              <w:rPr>
+                <w:b/>
+              </w:rPr>
+              <w:t>GIẢM</w:t>
+            </w:r>
+            <w:r>
+              <w:t xml:space="preserve">. Chỉ được kết luận theo một trong hai cách: (a) </w:t>
+            </w:r>
+            <w:r>
+              <w:rPr>
+                <w:b/>
+              </w:rPr>
+              <w:t>cặp câu neo</w:t>
+            </w:r>
+            <w:r>
+              <w:t xml:space="preserve"> — hai lần trả lời cùng một câu neo, cùng </w:t>
+            </w:r>
+            <w:r>
+              <w:rPr>
+                <w:rFonts w:ascii="Consolas" w:hAnsi="Consolas"/>
+                <w:color w:val="1B3A6B"/>
+              </w:rPr>
+              <w:t>scorer_version</w:t>
+            </w:r>
+            <w:r>
+              <w:t xml:space="preserve">, ngưỡng MDC95; (b) </w:t>
+            </w:r>
+            <w:r>
+              <w:rPr>
+                <w:b/>
+              </w:rPr>
+              <w:t>cửa sổ</w:t>
+            </w:r>
+            <w:r>
+              <w:t xml:space="preserve"> — trung bình k quan sát gần nhất so với k quan sát trước đó, cùng </w:t>
+            </w:r>
+            <w:r>
+              <w:rPr>
+                <w:rFonts w:ascii="Consolas" w:hAnsi="Consolas"/>
+                <w:color w:val="1B3A6B"/>
+              </w:rPr>
+              <w:t>scorer_version</w:t>
+            </w:r>
+            <w:r>
+              <w:t xml:space="preserve">, ngưỡng MDC95 / √k. Hai lượt đơn lẻ trên hai câu khác nhau </w:t>
+            </w:r>
+            <w:r>
+              <w:rPr>
+                <w:b/>
+              </w:rPr>
+              <w:t>không</w:t>
+            </w:r>
+            <w:r>
+              <w:t xml:space="preserve"> được gắn TIẾN BỘ THẬT hay GIẢM. Khái niệm chưa đủ dữ liệu hiển thị "cần thêm lần đo". Không dùng mũi tên xanh hay chữ "tiến bộ" cho thay đổi trong biên nhiễu.</w:t>
+            </w:r>
+          </w:p>
+        </w:tc>
+        <w:tc>
+          <w:tcPr>
+            <w:tcW w:type="dxa" w:w="2160"/>
+          </w:tcPr>
+          <w:p>
+            <w:r/>
+            <w:r>
+              <w:t>Hợp đồng §1.4.3, SF-07</w:t>
+            </w:r>
+          </w:p>
+        </w:tc>
+      </w:tr>
+      <w:tr>
+        <w:tc>
+          <w:tcPr>
+            <w:tcW w:type="dxa" w:w="2160"/>
+          </w:tcPr>
+          <w:p>
+            <w:r/>
+            <w:r>
+              <w:t>P-05</w:t>
+            </w:r>
+          </w:p>
+        </w:tc>
+        <w:tc>
+          <w:tcPr>
+            <w:tcW w:type="dxa" w:w="2160"/>
+          </w:tcPr>
+          <w:p>
+            <w:r/>
+            <w:r>
+              <w:t>P1</w:t>
+            </w:r>
+          </w:p>
+        </w:tc>
+        <w:tc>
+          <w:tcPr>
+            <w:tcW w:type="dxa" w:w="2160"/>
+          </w:tcPr>
+          <w:p>
+            <w:r/>
+            <w:r>
+              <w:rPr>
+                <w:b/>
+              </w:rPr>
+              <w:t>Câu neo.</w:t>
+            </w:r>
+            <w:r>
+              <w:t xml:space="preserve"> Mỗi khái niệm trong taxonomy đang dùng có ít nhất một câu đã duyệt được đánh dấu neo. Câu neo được hỏi lại sau tối thiểu 7 ngày; bộ chọn câu không dùng câu neo cho mục đích khác. So sánh trước/sau ưu tiên cặp quan sát trên cùng câu neo.</w:t>
+            </w:r>
+          </w:p>
+        </w:tc>
+        <w:tc>
+          <w:tcPr>
+            <w:tcW w:type="dxa" w:w="2160"/>
+          </w:tcPr>
+          <w:p>
+            <w:r/>
+            <w:r>
+              <w:t>Hợp đồng §1.4.4 · Code — có xoay vòng câu theo người dùng (</w:t>
+            </w:r>
+            <w:r>
+              <w:rPr>
+                <w:rFonts w:ascii="Consolas" w:hAnsi="Consolas"/>
+                <w:color w:val="1B3A6B"/>
+              </w:rPr>
+              <w:t>question_selector.py</w:t>
+            </w:r>
+            <w:r>
+              <w:t xml:space="preserve">, </w:t>
+            </w:r>
+            <w:r>
+              <w:rPr>
+                <w:rFonts w:ascii="Consolas" w:hAnsi="Consolas"/>
+                <w:color w:val="1B3A6B"/>
+              </w:rPr>
+              <w:t>_question_exposure</w:t>
+            </w:r>
+            <w:r>
+              <w:t>)</w:t>
+            </w:r>
+          </w:p>
+        </w:tc>
+      </w:tr>
+      <w:tr>
+        <w:tc>
+          <w:tcPr>
+            <w:tcW w:type="dxa" w:w="2160"/>
+          </w:tcPr>
+          <w:p>
+            <w:r/>
+            <w:r>
+              <w:t>P-06</w:t>
+            </w:r>
+          </w:p>
+        </w:tc>
+        <w:tc>
+          <w:tcPr>
+            <w:tcW w:type="dxa" w:w="2160"/>
+          </w:tcPr>
+          <w:p>
+            <w:r/>
+            <w:r>
+              <w:t>P1</w:t>
+            </w:r>
+          </w:p>
+        </w:tc>
+        <w:tc>
+          <w:tcPr>
+            <w:tcW w:type="dxa" w:w="2160"/>
+          </w:tcPr>
+          <w:p>
+            <w:r/>
+            <w:r>
+              <w:rPr>
+                <w:b/>
+              </w:rPr>
+              <w:t>So sánh trước/sau.</w:t>
+            </w:r>
+            <w:r>
+              <w:t xml:space="preserve"> Với câu đã trả lời từ hai lần, hiển thị hai câu trả lời cạnh nhau, mức từng tiêu chí và tiêu chí nào đã đổi mức.</w:t>
+            </w:r>
+          </w:p>
+        </w:tc>
+        <w:tc>
+          <w:tcPr>
+            <w:tcW w:type="dxa" w:w="2160"/>
+          </w:tcPr>
+          <w:p>
+            <w:r/>
+            <w:r>
+              <w:t>Đề xuất</w:t>
+            </w:r>
+          </w:p>
+        </w:tc>
+      </w:tr>
+      <w:tr>
+        <w:tc>
+          <w:tcPr>
+            <w:tcW w:type="dxa" w:w="2160"/>
+          </w:tcPr>
+          <w:p>
+            <w:r/>
+            <w:r>
+              <w:t>P-07</w:t>
+            </w:r>
+          </w:p>
+        </w:tc>
+        <w:tc>
+          <w:tcPr>
+            <w:tcW w:type="dxa" w:w="2160"/>
+          </w:tcPr>
+          <w:p>
+            <w:r/>
+            <w:r>
+              <w:t>P1</w:t>
+            </w:r>
+          </w:p>
+        </w:tc>
+        <w:tc>
+          <w:tcPr>
+            <w:tcW w:type="dxa" w:w="2160"/>
+          </w:tcPr>
+          <w:p>
+            <w:r/>
+            <w:r>
+              <w:rPr>
+                <w:b/>
+              </w:rPr>
+              <w:t>Bản đồ phòng thủ CV.</w:t>
+            </w:r>
+            <w:r>
+              <w:t xml:space="preserve"> Từ CV đã bóc tách, liệt kê các tuyên bố có thể bị hỏi (dự án, vai trò, con số, công nghệ), mỗi mục kèm đoạn bằng chứng trong CV. Mỗi mục có trạng thái </w:t>
+            </w:r>
+            <w:r>
+              <w:rPr>
+                <w:b/>
+              </w:rPr>
+              <w:t>CHƯA HỎI / VỮNG / LUNG LAY</w:t>
+            </w:r>
+            <w:r>
+              <w:t>. Phiên sau ưu tiên hỏi mục CHƯA HỎI và LUNG LAY. Thay câu VALIDATE mẫu hiện tại.</w:t>
+            </w:r>
+          </w:p>
+        </w:tc>
+        <w:tc>
+          <w:tcPr>
+            <w:tcW w:type="dxa" w:w="2160"/>
+          </w:tcPr>
+          <w:p>
+            <w:r/>
+            <w:r>
+              <w:t xml:space="preserve">Hợp đồng §1.4.5 · Code — bộ bóc tách CV evidence-first, </w:t>
+            </w:r>
+            <w:r>
+              <w:rPr>
+                <w:rFonts w:ascii="Consolas" w:hAnsi="Consolas"/>
+                <w:color w:val="1B3A6B"/>
+              </w:rPr>
+              <w:t>project_evidence.py</w:t>
+            </w:r>
+          </w:p>
+        </w:tc>
+      </w:tr>
+      <w:tr>
+        <w:tc>
+          <w:tcPr>
+            <w:tcW w:type="dxa" w:w="2160"/>
+          </w:tcPr>
+          <w:p>
+            <w:r/>
+            <w:r>
+              <w:t>P-08</w:t>
+            </w:r>
+          </w:p>
+        </w:tc>
+        <w:tc>
+          <w:tcPr>
+            <w:tcW w:type="dxa" w:w="2160"/>
+          </w:tcPr>
+          <w:p>
+            <w:r/>
+            <w:r>
+              <w:t>P1</w:t>
+            </w:r>
+          </w:p>
+        </w:tc>
+        <w:tc>
+          <w:tcPr>
+            <w:tcW w:type="dxa" w:w="2160"/>
+          </w:tcPr>
+          <w:p>
+            <w:r/>
+            <w:r>
+              <w:rPr>
+                <w:b/>
+              </w:rPr>
+              <w:t>Mức sẵn sàng theo JD mục tiêu.</w:t>
+            </w:r>
+            <w:r>
+              <w:t xml:space="preserve"> Với JD ứng viên chọn làm mục tiêu: mỗi khái niệm bắt buộc hiển thị mức hiện tại, khoảng tin cậy và mức JD cần. Tổng quan là </w:t>
+            </w:r>
+            <w:r>
+              <w:rPr>
+                <w:b/>
+              </w:rPr>
+              <w:t>số khái niệm bắt buộc đã đạt / tổng số</w:t>
+            </w:r>
+            <w:r>
+              <w:t>, không phải một phần trăm duy nhất. Thay ô "Readiness" đang hiển thị "—".</w:t>
+            </w:r>
+          </w:p>
+        </w:tc>
+        <w:tc>
+          <w:tcPr>
+            <w:tcW w:type="dxa" w:w="2160"/>
+          </w:tcPr>
+          <w:p>
+            <w:r/>
+            <w:r>
+              <w:t xml:space="preserve">Đề xuất · Code — frontend </w:t>
+            </w:r>
+            <w:r>
+              <w:rPr>
+                <w:rFonts w:ascii="Consolas" w:hAnsi="Consolas"/>
+                <w:color w:val="1B3A6B"/>
+              </w:rPr>
+              <w:t>UserDashboardHome.tsx</w:t>
+            </w:r>
+          </w:p>
+        </w:tc>
+      </w:tr>
+      <w:tr>
+        <w:tc>
+          <w:tcPr>
+            <w:tcW w:type="dxa" w:w="2160"/>
+          </w:tcPr>
+          <w:p>
+            <w:r/>
+            <w:r>
+              <w:t>P-09</w:t>
+            </w:r>
+          </w:p>
+        </w:tc>
+        <w:tc>
+          <w:tcPr>
+            <w:tcW w:type="dxa" w:w="2160"/>
+          </w:tcPr>
+          <w:p>
+            <w:r/>
+            <w:r>
+              <w:t>P2</w:t>
+            </w:r>
+          </w:p>
+        </w:tc>
+        <w:tc>
+          <w:tcPr>
+            <w:tcW w:type="dxa" w:w="2160"/>
+          </w:tcPr>
+          <w:p>
+            <w:r/>
+            <w:r>
+              <w:rPr>
+                <w:b/>
+              </w:rPr>
+              <w:t>Buổi luyện kế tiếp.</w:t>
+            </w:r>
+            <w:r>
+              <w:t xml:space="preserve"> Gợi ý khái niệm có (độ quan trọng trong JD mục tiêu × khoảng cách tới mức cần × độ bất định) lớn nhất, kèm một câu giải thích vì sao.</w:t>
+            </w:r>
+          </w:p>
+        </w:tc>
+        <w:tc>
+          <w:tcPr>
+            <w:tcW w:type="dxa" w:w="2160"/>
+          </w:tcPr>
+          <w:p>
+            <w:r/>
+            <w:r>
+              <w:t>Đề xuất</w:t>
+            </w:r>
+          </w:p>
+        </w:tc>
+      </w:tr>
+      <w:tr>
+        <w:tc>
+          <w:tcPr>
+            <w:tcW w:type="dxa" w:w="2160"/>
+          </w:tcPr>
+          <w:p>
+            <w:r/>
+            <w:r>
+              <w:t>P-10</w:t>
+            </w:r>
+          </w:p>
+        </w:tc>
+        <w:tc>
+          <w:tcPr>
+            <w:tcW w:type="dxa" w:w="2160"/>
+          </w:tcPr>
+          <w:p>
+            <w:r/>
+            <w:r>
+              <w:t>P2</w:t>
+            </w:r>
+          </w:p>
+        </w:tc>
+        <w:tc>
+          <w:tcPr>
+            <w:tcW w:type="dxa" w:w="2160"/>
+          </w:tcPr>
+          <w:p>
+            <w:r/>
+            <w:r>
+              <w:rPr>
+                <w:b/>
+              </w:rPr>
+              <w:t>Ngày phỏng vấn thật.</w:t>
+            </w:r>
+            <w:r>
+              <w:t xml:space="preserve"> Ứng viên nhập ngày; hệ thống chia các buổi ngắn rải đều đến ngày đó thay vì một buổi dài sát ngày.</w:t>
+            </w:r>
+          </w:p>
+        </w:tc>
+        <w:tc>
+          <w:tcPr>
+            <w:tcW w:type="dxa" w:w="2160"/>
+          </w:tcPr>
+          <w:p>
+            <w:r/>
+            <w:r>
+              <w:t>Khảo sát — iatrox.com, andymatuschak.org (bằng chứng riêng cho phỏng vấn còn mỏng)</w:t>
+            </w:r>
+          </w:p>
+        </w:tc>
+      </w:tr>
+      <w:tr>
+        <w:tc>
+          <w:tcPr>
+            <w:tcW w:type="dxa" w:w="2160"/>
+          </w:tcPr>
+          <w:p>
+            <w:r/>
+            <w:r>
+              <w:t>P-11</w:t>
+            </w:r>
+          </w:p>
+        </w:tc>
+        <w:tc>
+          <w:tcPr>
+            <w:tcW w:type="dxa" w:w="2160"/>
+          </w:tcPr>
+          <w:p>
+            <w:r/>
+            <w:r>
+              <w:t>P2</w:t>
+            </w:r>
+          </w:p>
+        </w:tc>
+        <w:tc>
+          <w:tcPr>
+            <w:tcW w:type="dxa" w:w="2160"/>
+          </w:tcPr>
+          <w:p>
+            <w:r/>
+            <w:r>
+              <w:rPr>
+                <w:b/>
+              </w:rPr>
+              <w:t>Tóm tắt tuần</w:t>
+            </w:r>
+            <w:r>
+              <w:t xml:space="preserve"> trong ứng dụng: số buổi, khái niệm TIẾN BỘ THẬT, khái niệm cần đo lại, buổi gợi ý.</w:t>
+            </w:r>
+          </w:p>
+        </w:tc>
+        <w:tc>
+          <w:tcPr>
+            <w:tcW w:type="dxa" w:w="2160"/>
+          </w:tcPr>
+          <w:p>
+            <w:r/>
+            <w:r>
+              <w:t>Đề xuất</w:t>
+            </w:r>
+          </w:p>
+        </w:tc>
+      </w:tr>
+    </w:tbl>
+    <w:p/>
+    <w:p>
+      <w:pPr>
+        <w:pStyle w:val="Heading2"/>
+      </w:pPr>
+      <w:r>
+        <w:t>7.7 Dữ liệu và API đề xuất</w:t>
+      </w:r>
+    </w:p>
+    <w:tbl>
+      <w:tblPr>
+        <w:tblStyle w:val="TableGrid"/>
+        <w:tblW w:type="auto" w:w="0"/>
+        <w:tblLook w:firstColumn="1" w:firstRow="1" w:lastColumn="0" w:lastRow="0" w:noHBand="0" w:noVBand="1" w:val="04A0"/>
+      </w:tblPr>
+      <w:tblGrid>
+        <w:gridCol w:w="2880"/>
+        <w:gridCol w:w="2880"/>
+        <w:gridCol w:w="2880"/>
+      </w:tblGrid>
+      <w:tr>
+        <w:tc>
+          <w:tcPr>
+            <w:tcW w:type="dxa" w:w="2880"/>
+            <w:shd w:val="clear" w:color="auto" w:fill="E9EDF4"/>
+          </w:tcPr>
+          <w:p>
+            <w:r>
+              <w:rPr>
+                <w:b/>
+              </w:rPr>
+            </w:r>
+            <w:r>
+              <w:rPr>
+                <w:b/>
+              </w:rPr>
+              <w:t>Bảng</w:t>
+            </w:r>
+          </w:p>
+        </w:tc>
+        <w:tc>
+          <w:tcPr>
+            <w:tcW w:type="dxa" w:w="2880"/>
+            <w:shd w:val="clear" w:color="auto" w:fill="E9EDF4"/>
+          </w:tcPr>
+          <w:p>
+            <w:r>
+              <w:rPr>
+                <w:b/>
+              </w:rPr>
+            </w:r>
+            <w:r>
+              <w:rPr>
+                <w:b/>
+              </w:rPr>
+              <w:t>Cột chính</w:t>
+            </w:r>
+          </w:p>
+        </w:tc>
+        <w:tc>
+          <w:tcPr>
+            <w:tcW w:type="dxa" w:w="2880"/>
+            <w:shd w:val="clear" w:color="auto" w:fill="E9EDF4"/>
+          </w:tcPr>
+          <w:p>
+            <w:r>
+              <w:rPr>
+                <w:b/>
+              </w:rPr>
+            </w:r>
+            <w:r>
+              <w:rPr>
+                <w:b/>
+              </w:rPr>
+              <w:t>Ghi chú</w:t>
+            </w:r>
+          </w:p>
+        </w:tc>
+      </w:tr>
+      <w:tr>
+        <w:tc>
+          <w:tcPr>
+            <w:tcW w:type="dxa" w:w="2880"/>
+          </w:tcPr>
+          <w:p>
+            <w:r/>
+            <w:r>
+              <w:rPr>
+                <w:rFonts w:ascii="Consolas" w:hAnsi="Consolas"/>
+                <w:color w:val="1B3A6B"/>
+              </w:rPr>
+              <w:t>skill_observations</w:t>
+            </w:r>
+          </w:p>
+        </w:tc>
+        <w:tc>
+          <w:tcPr>
+            <w:tcW w:type="dxa" w:w="2880"/>
+          </w:tcPr>
+          <w:p>
+            <w:r/>
+            <w:r>
+              <w:rPr>
+                <w:rFonts w:ascii="Consolas" w:hAnsi="Consolas"/>
+                <w:color w:val="1B3A6B"/>
+              </w:rPr>
+              <w:t>user_id</w:t>
+            </w:r>
+            <w:r>
+              <w:t xml:space="preserve">, </w:t>
+            </w:r>
+            <w:r>
+              <w:rPr>
+                <w:rFonts w:ascii="Consolas" w:hAnsi="Consolas"/>
+                <w:color w:val="1B3A6B"/>
+              </w:rPr>
+              <w:t>session_id</w:t>
+            </w:r>
+            <w:r>
+              <w:t xml:space="preserve">, </w:t>
+            </w:r>
+            <w:r>
+              <w:rPr>
+                <w:rFonts w:ascii="Consolas" w:hAnsi="Consolas"/>
+                <w:color w:val="1B3A6B"/>
+              </w:rPr>
+              <w:t>turn_id</w:t>
+            </w:r>
+            <w:r>
+              <w:t xml:space="preserve">, </w:t>
+            </w:r>
+            <w:r>
+              <w:rPr>
+                <w:rFonts w:ascii="Consolas" w:hAnsi="Consolas"/>
+                <w:color w:val="1B3A6B"/>
+              </w:rPr>
+              <w:t>concept_id</w:t>
+            </w:r>
+            <w:r>
+              <w:t xml:space="preserve">, </w:t>
+            </w:r>
+            <w:r>
+              <w:rPr>
+                <w:rFonts w:ascii="Consolas" w:hAnsi="Consolas"/>
+                <w:color w:val="1B3A6B"/>
+              </w:rPr>
+              <w:t>taxonomy_version</w:t>
+            </w:r>
+            <w:r>
+              <w:t xml:space="preserve">, </w:t>
+            </w:r>
+            <w:r>
+              <w:rPr>
+                <w:rFonts w:ascii="Consolas" w:hAnsi="Consolas"/>
+                <w:color w:val="1B3A6B"/>
+              </w:rPr>
+              <w:t>question_version_id</w:t>
+            </w:r>
+            <w:r>
+              <w:t xml:space="preserve">, </w:t>
+            </w:r>
+            <w:r>
+              <w:rPr>
+                <w:rFonts w:ascii="Consolas" w:hAnsi="Consolas"/>
+                <w:color w:val="1B3A6B"/>
+              </w:rPr>
+              <w:t>rubric_version_id</w:t>
+            </w:r>
+            <w:r>
+              <w:t xml:space="preserve">, </w:t>
+            </w:r>
+            <w:r>
+              <w:rPr>
+                <w:rFonts w:ascii="Consolas" w:hAnsi="Consolas"/>
+                <w:color w:val="1B3A6B"/>
+              </w:rPr>
+              <w:t>scorer_version</w:t>
+            </w:r>
+            <w:r>
+              <w:t xml:space="preserve">, </w:t>
+            </w:r>
+            <w:r>
+              <w:rPr>
+                <w:rFonts w:ascii="Consolas" w:hAnsi="Consolas"/>
+                <w:color w:val="1B3A6B"/>
+              </w:rPr>
+              <w:t>is_anchor</w:t>
+            </w:r>
+            <w:r>
+              <w:t xml:space="preserve">, </w:t>
+            </w:r>
+            <w:r>
+              <w:rPr>
+                <w:rFonts w:ascii="Consolas" w:hAnsi="Consolas"/>
+                <w:color w:val="1B3A6B"/>
+              </w:rPr>
+              <w:t>criterion_levels</w:t>
+            </w:r>
+            <w:r>
+              <w:t xml:space="preserve"> (JSONB), </w:t>
+            </w:r>
+            <w:r>
+              <w:rPr>
+                <w:rFonts w:ascii="Consolas" w:hAnsi="Consolas"/>
+                <w:color w:val="1B3A6B"/>
+              </w:rPr>
+              <w:t>score</w:t>
+            </w:r>
+            <w:r>
+              <w:t xml:space="preserve">, </w:t>
+            </w:r>
+            <w:r>
+              <w:rPr>
+                <w:rFonts w:ascii="Consolas" w:hAnsi="Consolas"/>
+                <w:color w:val="1B3A6B"/>
+              </w:rPr>
+              <w:t>observed_at</w:t>
+            </w:r>
+          </w:p>
+        </w:tc>
+        <w:tc>
+          <w:tcPr>
+            <w:tcW w:type="dxa" w:w="2880"/>
+          </w:tcPr>
+          <w:p>
+            <w:r/>
+            <w:r>
+              <w:t>Một dòng cho mỗi lượt đã chấm hợp lệ. Không lưu nội dung câu trả lời.</w:t>
+            </w:r>
+          </w:p>
+        </w:tc>
+      </w:tr>
+      <w:tr>
+        <w:tc>
+          <w:tcPr>
+            <w:tcW w:type="dxa" w:w="2880"/>
+          </w:tcPr>
+          <w:p>
+            <w:r/>
+            <w:r>
+              <w:rPr>
+                <w:rFonts w:ascii="Consolas" w:hAnsi="Consolas"/>
+                <w:color w:val="1B3A6B"/>
+              </w:rPr>
+              <w:t>scorer_calibrations</w:t>
+            </w:r>
+          </w:p>
+        </w:tc>
+        <w:tc>
+          <w:tcPr>
+            <w:tcW w:type="dxa" w:w="2880"/>
+          </w:tcPr>
+          <w:p>
+            <w:r/>
+            <w:r>
+              <w:rPr>
+                <w:rFonts w:ascii="Consolas" w:hAnsi="Consolas"/>
+                <w:color w:val="1B3A6B"/>
+              </w:rPr>
+              <w:t>scorer_version</w:t>
+            </w:r>
+            <w:r>
+              <w:t xml:space="preserve">, </w:t>
+            </w:r>
+            <w:r>
+              <w:rPr>
+                <w:rFonts w:ascii="Consolas" w:hAnsi="Consolas"/>
+                <w:color w:val="1B3A6B"/>
+              </w:rPr>
+              <w:t>concept_id</w:t>
+            </w:r>
+            <w:r>
+              <w:t xml:space="preserve">, </w:t>
+            </w:r>
+            <w:r>
+              <w:rPr>
+                <w:rFonts w:ascii="Consolas" w:hAnsi="Consolas"/>
+                <w:color w:val="1B3A6B"/>
+              </w:rPr>
+              <w:t>k</w:t>
+            </w:r>
+            <w:r>
+              <w:t xml:space="preserve">, </w:t>
+            </w:r>
+            <w:r>
+              <w:rPr>
+                <w:rFonts w:ascii="Consolas" w:hAnsi="Consolas"/>
+                <w:color w:val="1B3A6B"/>
+              </w:rPr>
+              <w:t>sem</w:t>
+            </w:r>
+            <w:r>
+              <w:t xml:space="preserve">, </w:t>
+            </w:r>
+            <w:r>
+              <w:rPr>
+                <w:rFonts w:ascii="Consolas" w:hAnsi="Consolas"/>
+                <w:color w:val="1B3A6B"/>
+              </w:rPr>
+              <w:t>mdc95</w:t>
+            </w:r>
+            <w:r>
+              <w:t xml:space="preserve">, </w:t>
+            </w:r>
+            <w:r>
+              <w:rPr>
+                <w:rFonts w:ascii="Consolas" w:hAnsi="Consolas"/>
+                <w:color w:val="1B3A6B"/>
+              </w:rPr>
+              <w:t>measured_at</w:t>
+            </w:r>
+          </w:p>
+        </w:tc>
+        <w:tc>
+          <w:tcPr>
+            <w:tcW w:type="dxa" w:w="2880"/>
+          </w:tcPr>
+          <w:p>
+            <w:r/>
+            <w:r>
+              <w:t xml:space="preserve">Mỗi lần đổi mô hình, prompt hoặc rubric là một </w:t>
+            </w:r>
+            <w:r>
+              <w:rPr>
+                <w:rFonts w:ascii="Consolas" w:hAnsi="Consolas"/>
+                <w:color w:val="1B3A6B"/>
+              </w:rPr>
+              <w:t>scorer_version</w:t>
+            </w:r>
+            <w:r>
+              <w:t xml:space="preserve"> mới.</w:t>
+            </w:r>
+          </w:p>
+        </w:tc>
+      </w:tr>
+      <w:tr>
+        <w:tc>
+          <w:tcPr>
+            <w:tcW w:type="dxa" w:w="2880"/>
+          </w:tcPr>
+          <w:p>
+            <w:r/>
+            <w:r>
+              <w:rPr>
+                <w:rFonts w:ascii="Consolas" w:hAnsi="Consolas"/>
+                <w:color w:val="1B3A6B"/>
+              </w:rPr>
+              <w:t>cv_claims</w:t>
+            </w:r>
+          </w:p>
+        </w:tc>
+        <w:tc>
+          <w:tcPr>
+            <w:tcW w:type="dxa" w:w="2880"/>
+          </w:tcPr>
+          <w:p>
+            <w:r/>
+            <w:r>
+              <w:rPr>
+                <w:rFonts w:ascii="Consolas" w:hAnsi="Consolas"/>
+                <w:color w:val="1B3A6B"/>
+              </w:rPr>
+              <w:t>resume_id</w:t>
+            </w:r>
+            <w:r>
+              <w:t xml:space="preserve">, </w:t>
+            </w:r>
+            <w:r>
+              <w:rPr>
+                <w:rFonts w:ascii="Consolas" w:hAnsi="Consolas"/>
+                <w:color w:val="1B3A6B"/>
+              </w:rPr>
+              <w:t>claim_id</w:t>
+            </w:r>
+            <w:r>
+              <w:t xml:space="preserve">, </w:t>
+            </w:r>
+            <w:r>
+              <w:rPr>
+                <w:rFonts w:ascii="Consolas" w:hAnsi="Consolas"/>
+                <w:color w:val="1B3A6B"/>
+              </w:rPr>
+              <w:t>kind</w:t>
+            </w:r>
+            <w:r>
+              <w:t xml:space="preserve">, </w:t>
+            </w:r>
+            <w:r>
+              <w:rPr>
+                <w:rFonts w:ascii="Consolas" w:hAnsi="Consolas"/>
+                <w:color w:val="1B3A6B"/>
+              </w:rPr>
+              <w:t>text</w:t>
+            </w:r>
+            <w:r>
+              <w:t xml:space="preserve">, </w:t>
+            </w:r>
+            <w:r>
+              <w:rPr>
+                <w:rFonts w:ascii="Consolas" w:hAnsi="Consolas"/>
+                <w:color w:val="1B3A6B"/>
+              </w:rPr>
+              <w:t>evidence_span</w:t>
+            </w:r>
+            <w:r>
+              <w:t xml:space="preserve">, </w:t>
+            </w:r>
+            <w:r>
+              <w:rPr>
+                <w:rFonts w:ascii="Consolas" w:hAnsi="Consolas"/>
+                <w:color w:val="1B3A6B"/>
+              </w:rPr>
+              <w:t>status</w:t>
+            </w:r>
+            <w:r>
+              <w:t xml:space="preserve">, </w:t>
+            </w:r>
+            <w:r>
+              <w:rPr>
+                <w:rFonts w:ascii="Consolas" w:hAnsi="Consolas"/>
+                <w:color w:val="1B3A6B"/>
+              </w:rPr>
+              <w:t>last_probed_session_id</w:t>
+            </w:r>
+          </w:p>
+        </w:tc>
+        <w:tc>
+          <w:tcPr>
+            <w:tcW w:type="dxa" w:w="2880"/>
+          </w:tcPr>
+          <w:p>
+            <w:r/>
+            <w:r>
+              <w:t>Phục vụ P-07.</w:t>
+            </w:r>
+          </w:p>
+        </w:tc>
+      </w:tr>
+      <w:tr>
+        <w:tc>
+          <w:tcPr>
+            <w:tcW w:type="dxa" w:w="2880"/>
+          </w:tcPr>
+          <w:p>
+            <w:r/>
+            <w:r>
+              <w:rPr>
+                <w:rFonts w:ascii="Consolas" w:hAnsi="Consolas"/>
+                <w:color w:val="1B3A6B"/>
+              </w:rPr>
+              <w:t>practice_goals</w:t>
+            </w:r>
+          </w:p>
+        </w:tc>
+        <w:tc>
+          <w:tcPr>
+            <w:tcW w:type="dxa" w:w="2880"/>
+          </w:tcPr>
+          <w:p>
+            <w:r/>
+            <w:r>
+              <w:rPr>
+                <w:rFonts w:ascii="Consolas" w:hAnsi="Consolas"/>
+                <w:color w:val="1B3A6B"/>
+              </w:rPr>
+              <w:t>user_id</w:t>
+            </w:r>
+            <w:r>
+              <w:t xml:space="preserve">, </w:t>
+            </w:r>
+            <w:r>
+              <w:rPr>
+                <w:rFonts w:ascii="Consolas" w:hAnsi="Consolas"/>
+                <w:color w:val="1B3A6B"/>
+              </w:rPr>
+              <w:t>target_job_id</w:t>
+            </w:r>
+            <w:r>
+              <w:t xml:space="preserve">, </w:t>
+            </w:r>
+            <w:r>
+              <w:rPr>
+                <w:rFonts w:ascii="Consolas" w:hAnsi="Consolas"/>
+                <w:color w:val="1B3A6B"/>
+              </w:rPr>
+              <w:t>interview_date</w:t>
+            </w:r>
+            <w:r>
+              <w:t xml:space="preserve">, </w:t>
+            </w:r>
+            <w:r>
+              <w:rPr>
+                <w:rFonts w:ascii="Consolas" w:hAnsi="Consolas"/>
+                <w:color w:val="1B3A6B"/>
+              </w:rPr>
+              <w:t>created_at</w:t>
+            </w:r>
+          </w:p>
+        </w:tc>
+        <w:tc>
+          <w:tcPr>
+            <w:tcW w:type="dxa" w:w="2880"/>
+          </w:tcPr>
+          <w:p>
+            <w:r/>
+            <w:r>
+              <w:t>Phục vụ P-08 đến P-10.</w:t>
+            </w:r>
+          </w:p>
+        </w:tc>
+      </w:tr>
+    </w:tbl>
+    <w:p/>
+    <w:p>
+      <w:r>
+        <w:t xml:space="preserve">Bảng </w:t>
+      </w:r>
+      <w:r>
+        <w:rPr>
+          <w:rFonts w:ascii="Consolas" w:hAnsi="Consolas"/>
+          <w:color w:val="1B3A6B"/>
+        </w:rPr>
+        <w:t>scoring_history</w:t>
+      </w:r>
+      <w:r>
+        <w:t xml:space="preserve"> (migration 0001) hiện không có ai dùng; thay bằng </w:t>
+      </w:r>
+      <w:r>
+        <w:rPr>
+          <w:rFonts w:ascii="Consolas" w:hAnsi="Consolas"/>
+          <w:color w:val="1B3A6B"/>
+        </w:rPr>
+        <w:t>skill_observations</w:t>
+      </w:r>
+      <w:r>
+        <w:t xml:space="preserve"> hoặc xóa.</w:t>
+      </w:r>
+    </w:p>
+    <w:tbl>
+      <w:tblPr>
+        <w:tblStyle w:val="TableGrid"/>
+        <w:tblW w:type="auto" w:w="0"/>
+        <w:tblLook w:firstColumn="1" w:firstRow="1" w:lastColumn="0" w:lastRow="0" w:noHBand="0" w:noVBand="1" w:val="04A0"/>
+      </w:tblPr>
+      <w:tblGrid>
+        <w:gridCol w:w="4320"/>
+        <w:gridCol w:w="4320"/>
+      </w:tblGrid>
+      <w:tr>
+        <w:tc>
+          <w:tcPr>
+            <w:tcW w:type="dxa" w:w="4320"/>
+            <w:shd w:val="clear" w:color="auto" w:fill="E9EDF4"/>
+          </w:tcPr>
+          <w:p>
+            <w:r>
+              <w:rPr>
+                <w:b/>
+              </w:rPr>
+            </w:r>
+            <w:r>
+              <w:rPr>
+                <w:b/>
+              </w:rPr>
+              <w:t>Endpoint</w:t>
+            </w:r>
+          </w:p>
+        </w:tc>
+        <w:tc>
+          <w:tcPr>
+            <w:tcW w:type="dxa" w:w="4320"/>
+            <w:shd w:val="clear" w:color="auto" w:fill="E9EDF4"/>
+          </w:tcPr>
+          <w:p>
+            <w:r>
+              <w:rPr>
+                <w:b/>
+              </w:rPr>
+            </w:r>
+            <w:r>
+              <w:rPr>
+                <w:b/>
+              </w:rPr>
+              <w:t>Trả về</w:t>
+            </w:r>
+          </w:p>
+        </w:tc>
+      </w:tr>
+      <w:tr>
+        <w:tc>
+          <w:tcPr>
+            <w:tcW w:type="dxa" w:w="4320"/>
+          </w:tcPr>
+          <w:p>
+            <w:r/>
+            <w:r>
+              <w:rPr>
+                <w:rFonts w:ascii="Consolas" w:hAnsi="Consolas"/>
+                <w:color w:val="1B3A6B"/>
+              </w:rPr>
+              <w:t>GET /api/v1/progress/overview</w:t>
+            </w:r>
+          </w:p>
+        </w:tc>
+        <w:tc>
+          <w:tcPr>
+            <w:tcW w:type="dxa" w:w="4320"/>
+          </w:tcPr>
+          <w:p>
+            <w:r/>
+            <w:r>
+              <w:t>Số buổi, thời gian luyện, khái niệm TIẾN BỘ THẬT gần đây, buổi gợi ý</w:t>
+            </w:r>
+          </w:p>
+        </w:tc>
+      </w:tr>
+      <w:tr>
+        <w:tc>
+          <w:tcPr>
+            <w:tcW w:type="dxa" w:w="4320"/>
+          </w:tcPr>
+          <w:p>
+            <w:r/>
+            <w:r>
+              <w:rPr>
+                <w:rFonts w:ascii="Consolas" w:hAnsi="Consolas"/>
+                <w:color w:val="1B3A6B"/>
+              </w:rPr>
+              <w:t>GET /api/v1/progress/skills</w:t>
+            </w:r>
+          </w:p>
+        </w:tc>
+        <w:tc>
+          <w:tcPr>
+            <w:tcW w:type="dxa" w:w="4320"/>
+          </w:tcPr>
+          <w:p>
+            <w:r/>
+            <w:r>
+              <w:t>Mỗi khái niệm: ước lượng hiện tại, khoảng tin cậy, số quan sát, chỉ báo P-04</w:t>
+            </w:r>
+          </w:p>
+        </w:tc>
+      </w:tr>
+      <w:tr>
+        <w:tc>
+          <w:tcPr>
+            <w:tcW w:type="dxa" w:w="4320"/>
+          </w:tcPr>
+          <w:p>
+            <w:r/>
+            <w:r>
+              <w:rPr>
+                <w:rFonts w:ascii="Consolas" w:hAnsi="Consolas"/>
+                <w:color w:val="1B3A6B"/>
+              </w:rPr>
+              <w:t>GET /api/v1/progress/skills/{conceptId}</w:t>
+            </w:r>
+          </w:p>
+        </w:tc>
+        <w:tc>
+          <w:tcPr>
+            <w:tcW w:type="dxa" w:w="4320"/>
+          </w:tcPr>
+          <w:p>
+            <w:r/>
+            <w:r>
+              <w:t xml:space="preserve">Chuỗi quan sát theo thời gian, đánh dấu chỗ đổi </w:t>
+            </w:r>
+            <w:r>
+              <w:rPr>
+                <w:rFonts w:ascii="Consolas" w:hAnsi="Consolas"/>
+                <w:color w:val="1B3A6B"/>
+              </w:rPr>
+              <w:t>scorer_version</w:t>
+            </w:r>
+          </w:p>
+        </w:tc>
+      </w:tr>
+      <w:tr>
+        <w:tc>
+          <w:tcPr>
+            <w:tcW w:type="dxa" w:w="4320"/>
+          </w:tcPr>
+          <w:p>
+            <w:r/>
+            <w:r>
+              <w:rPr>
+                <w:rFonts w:ascii="Consolas" w:hAnsi="Consolas"/>
+                <w:color w:val="1B3A6B"/>
+              </w:rPr>
+              <w:t>GET /api/v1/progress/readiness?jobId=</w:t>
+            </w:r>
+          </w:p>
+        </w:tc>
+        <w:tc>
+          <w:tcPr>
+            <w:tcW w:type="dxa" w:w="4320"/>
+          </w:tcPr>
+          <w:p>
+            <w:r/>
+            <w:r>
+              <w:t>P-08 cho một JD</w:t>
+            </w:r>
+          </w:p>
+        </w:tc>
+      </w:tr>
+      <w:tr>
+        <w:tc>
+          <w:tcPr>
+            <w:tcW w:type="dxa" w:w="4320"/>
+          </w:tcPr>
+          <w:p>
+            <w:r/>
+            <w:r>
+              <w:rPr>
+                <w:rFonts w:ascii="Consolas" w:hAnsi="Consolas"/>
+                <w:color w:val="1B3A6B"/>
+              </w:rPr>
+              <w:t>GET /api/v1/progress/cv-defense?resumeId=</w:t>
+            </w:r>
+          </w:p>
+        </w:tc>
+        <w:tc>
+          <w:tcPr>
+            <w:tcW w:type="dxa" w:w="4320"/>
+          </w:tcPr>
+          <w:p>
+            <w:r/>
+            <w:r>
+              <w:t>P-07</w:t>
+            </w:r>
+          </w:p>
+        </w:tc>
+      </w:tr>
+      <w:tr>
+        <w:tc>
+          <w:tcPr>
+            <w:tcW w:type="dxa" w:w="4320"/>
+          </w:tcPr>
+          <w:p>
+            <w:r/>
+            <w:r>
+              <w:rPr>
+                <w:rFonts w:ascii="Consolas" w:hAnsi="Consolas"/>
+                <w:color w:val="1B3A6B"/>
+              </w:rPr>
+              <w:t>PUT /api/v1/progress/goal</w:t>
+            </w:r>
+          </w:p>
+        </w:tc>
+        <w:tc>
+          <w:tcPr>
+            <w:tcW w:type="dxa" w:w="4320"/>
+          </w:tcPr>
+          <w:p>
+            <w:r/>
+            <w:r>
+              <w:t>Đặt JD mục tiêu và ngày phỏng vấn</w:t>
+            </w:r>
+          </w:p>
+        </w:tc>
+      </w:tr>
+    </w:tbl>
+    <w:p/>
+    <w:p>
+      <w:pPr>
+        <w:pStyle w:val="Heading2"/>
+      </w:pPr>
+      <w:r>
+        <w:t>7.8 Màn hình</w:t>
+      </w:r>
+    </w:p>
+    <w:tbl>
+      <w:tblPr>
+        <w:tblStyle w:val="TableGrid"/>
+        <w:tblW w:type="auto" w:w="0"/>
+        <w:tblLook w:firstColumn="1" w:firstRow="1" w:lastColumn="0" w:lastRow="0" w:noHBand="0" w:noVBand="1" w:val="04A0"/>
+      </w:tblPr>
+      <w:tblGrid>
+        <w:gridCol w:w="2880"/>
+        <w:gridCol w:w="2880"/>
+        <w:gridCol w:w="2880"/>
+      </w:tblGrid>
+      <w:tr>
+        <w:tc>
+          <w:tcPr>
+            <w:tcW w:type="dxa" w:w="2880"/>
+            <w:shd w:val="clear" w:color="auto" w:fill="E9EDF4"/>
+          </w:tcPr>
+          <w:p>
+            <w:r>
+              <w:rPr>
+                <w:b/>
+              </w:rPr>
+            </w:r>
+            <w:r>
+              <w:rPr>
+                <w:b/>
+              </w:rPr>
+              <w:t>Màn hình</w:t>
+            </w:r>
+          </w:p>
+        </w:tc>
+        <w:tc>
+          <w:tcPr>
+            <w:tcW w:type="dxa" w:w="2880"/>
+            <w:shd w:val="clear" w:color="auto" w:fill="E9EDF4"/>
+          </w:tcPr>
+          <w:p>
+            <w:r>
+              <w:rPr>
+                <w:b/>
+              </w:rPr>
+            </w:r>
+            <w:r>
+              <w:rPr>
+                <w:b/>
+              </w:rPr>
+              <w:t>Nội dung</w:t>
+            </w:r>
+          </w:p>
+        </w:tc>
+        <w:tc>
+          <w:tcPr>
+            <w:tcW w:type="dxa" w:w="2880"/>
+            <w:shd w:val="clear" w:color="auto" w:fill="E9EDF4"/>
+          </w:tcPr>
+          <w:p>
+            <w:r>
+              <w:rPr>
+                <w:b/>
+              </w:rPr>
+            </w:r>
+            <w:r>
+              <w:rPr>
+                <w:b/>
+              </w:rPr>
+              <w:t>Thay cho</w:t>
+            </w:r>
+          </w:p>
+        </w:tc>
+      </w:tr>
+      <w:tr>
+        <w:tc>
+          <w:tcPr>
+            <w:tcW w:type="dxa" w:w="2880"/>
+          </w:tcPr>
+          <w:p>
+            <w:r/>
+            <w:r>
+              <w:t>Bảng điều khiển</w:t>
+            </w:r>
+          </w:p>
+        </w:tc>
+        <w:tc>
+          <w:tcPr>
+            <w:tcW w:type="dxa" w:w="2880"/>
+          </w:tcPr>
+          <w:p>
+            <w:r/>
+            <w:r>
+              <w:t>Mức sẵn sàng theo JD mục tiêu (x/y khái niệm đạt), buổi gợi ý kế tiếp, thời gian luyện tuần này</w:t>
+            </w:r>
+          </w:p>
+        </w:tc>
+        <w:tc>
+          <w:tcPr>
+            <w:tcW w:type="dxa" w:w="2880"/>
+          </w:tcPr>
+          <w:p>
+            <w:r/>
+            <w:r>
+              <w:t>Ô "Readiness" và "Practice time" đang hiện "—"</w:t>
+            </w:r>
+          </w:p>
+        </w:tc>
+      </w:tr>
+      <w:tr>
+        <w:tc>
+          <w:tcPr>
+            <w:tcW w:type="dxa" w:w="2880"/>
+          </w:tcPr>
+          <w:p>
+            <w:r/>
+            <w:r>
+              <w:t>Hành trình</w:t>
+            </w:r>
+          </w:p>
+        </w:tc>
+        <w:tc>
+          <w:tcPr>
+            <w:tcW w:type="dxa" w:w="2880"/>
+          </w:tcPr>
+          <w:p>
+            <w:r/>
+            <w:r>
+              <w:t>Dòng thời gian các buổi; mỗi buổi ghi khái niệm nào TIẾN BỘ THẬT, khái niệm nào GIẢM</w:t>
+            </w:r>
+          </w:p>
+        </w:tc>
+        <w:tc>
+          <w:tcPr>
+            <w:tcW w:type="dxa" w:w="2880"/>
+          </w:tcPr>
+          <w:p>
+            <w:r/>
+            <w:r>
+              <w:t>Danh sách 5 buổi gần nhất không có điểm</w:t>
+            </w:r>
+          </w:p>
+        </w:tc>
+      </w:tr>
+      <w:tr>
+        <w:tc>
+          <w:tcPr>
+            <w:tcW w:type="dxa" w:w="2880"/>
+          </w:tcPr>
+          <w:p>
+            <w:r/>
+            <w:r>
+              <w:t>Sổ kỹ năng</w:t>
+            </w:r>
+          </w:p>
+        </w:tc>
+        <w:tc>
+          <w:tcPr>
+            <w:tcW w:type="dxa" w:w="2880"/>
+          </w:tcPr>
+          <w:p>
+            <w:r/>
+            <w:r>
+              <w:t>Mỗi khái niệm một hàng: điểm hiện tại, dải tin cậy, đường xu hướng nhỏ, nhãn P-04</w:t>
+            </w:r>
+          </w:p>
+        </w:tc>
+        <w:tc>
+          <w:tcPr>
+            <w:tcW w:type="dxa" w:w="2880"/>
+          </w:tcPr>
+          <w:p>
+            <w:r/>
+            <w:r>
+              <w:t>Biểu đồ radar của một buổi</w:t>
+            </w:r>
+          </w:p>
+        </w:tc>
+      </w:tr>
+      <w:tr>
+        <w:tc>
+          <w:tcPr>
+            <w:tcW w:type="dxa" w:w="2880"/>
+          </w:tcPr>
+          <w:p>
+            <w:r/>
+            <w:r>
+              <w:t>Chi tiết kỹ năng</w:t>
+            </w:r>
+          </w:p>
+        </w:tc>
+        <w:tc>
+          <w:tcPr>
+            <w:tcW w:type="dxa" w:w="2880"/>
+          </w:tcPr>
+          <w:p>
+            <w:r/>
+            <w:r>
+              <w:t xml:space="preserve">Biểu đồ điểm theo thời gian có dải nhiễu; đánh dấu câu neo và chỗ đổi </w:t>
+            </w:r>
+            <w:r>
+              <w:rPr>
+                <w:rFonts w:ascii="Consolas" w:hAnsi="Consolas"/>
+                <w:color w:val="1B3A6B"/>
+              </w:rPr>
+              <w:t>scorer_version</w:t>
+            </w:r>
+            <w:r>
+              <w:t>; so sánh trước/sau</w:t>
+            </w:r>
+          </w:p>
+        </w:tc>
+        <w:tc>
+          <w:tcPr>
+            <w:tcW w:type="dxa" w:w="2880"/>
+          </w:tcPr>
+          <w:p>
+            <w:r/>
+            <w:r>
+              <w:t>—</w:t>
+            </w:r>
+          </w:p>
+        </w:tc>
+      </w:tr>
+      <w:tr>
+        <w:tc>
+          <w:tcPr>
+            <w:tcW w:type="dxa" w:w="2880"/>
+          </w:tcPr>
+          <w:p>
+            <w:r/>
+            <w:r>
+              <w:t>Phòng thủ CV</w:t>
+            </w:r>
+          </w:p>
+        </w:tc>
+        <w:tc>
+          <w:tcPr>
+            <w:tcW w:type="dxa" w:w="2880"/>
+          </w:tcPr>
+          <w:p>
+            <w:r/>
+            <w:r>
+              <w:t>Từng tuyên bố trong CV với trạng thái CHƯA HỎI / VỮNG / LUNG LAY và đoạn trả lời gần nhất</w:t>
+            </w:r>
+          </w:p>
+        </w:tc>
+        <w:tc>
+          <w:tcPr>
+            <w:tcW w:type="dxa" w:w="2880"/>
+          </w:tcPr>
+          <w:p>
+            <w:r/>
+            <w:r>
+              <w:t>Câu VALIDATE mẫu</w:t>
+            </w:r>
+          </w:p>
+        </w:tc>
+      </w:tr>
+      <w:tr>
+        <w:tc>
+          <w:tcPr>
+            <w:tcW w:type="dxa" w:w="2880"/>
+          </w:tcPr>
+          <w:p>
+            <w:r/>
+            <w:r>
+              <w:t>Báo cáo buổi</w:t>
+            </w:r>
+          </w:p>
+        </w:tc>
+        <w:tc>
+          <w:tcPr>
+            <w:tcW w:type="dxa" w:w="2880"/>
+          </w:tcPr>
+          <w:p>
+            <w:r/>
+            <w:r>
+              <w:t>Thêm khối "So với lần trước" theo khái niệm; tab mặc định là phản hồi cho ứng viên</w:t>
+            </w:r>
+          </w:p>
+        </w:tc>
+        <w:tc>
+          <w:tcPr>
+            <w:tcW w:type="dxa" w:w="2880"/>
+          </w:tcPr>
+          <w:p>
+            <w:r/>
+            <w:r>
+              <w:t>Tab nhà tuyển dụng đang mặc định</w:t>
+            </w:r>
+          </w:p>
+        </w:tc>
+      </w:tr>
+    </w:tbl>
+    <w:p/>
+    <w:p>
+      <w:pPr>
+        <w:pStyle w:val="Heading2"/>
+      </w:pPr>
+      <w:r>
+        <w:t>7.9 Luật trích dẫn bằng chứng cho R-11</w:t>
       </w:r>
     </w:p>
     <w:p>
@@ -4162,6 +7531,105 @@
                 <w:color w:val="1B3A6B"/>
               </w:rPr>
               <w:t>api/router.py</w:t>
+            </w:r>
+          </w:p>
+        </w:tc>
+      </w:tr>
+      <w:tr>
+        <w:tc>
+          <w:tcPr>
+            <w:tcW w:type="dxa" w:w="2880"/>
+          </w:tcPr>
+          <w:p>
+            <w:r/>
+            <w:r>
+              <w:t>NFR-08</w:t>
+            </w:r>
+          </w:p>
+        </w:tc>
+        <w:tc>
+          <w:tcPr>
+            <w:tcW w:type="dxa" w:w="2880"/>
+          </w:tcPr>
+          <w:p>
+            <w:r/>
+            <w:r>
+              <w:t xml:space="preserve">Mọi điểm lưu kèm </w:t>
+            </w:r>
+            <w:r>
+              <w:rPr>
+                <w:rFonts w:ascii="Consolas" w:hAnsi="Consolas"/>
+                <w:color w:val="1B3A6B"/>
+              </w:rPr>
+              <w:t>scorer_version</w:t>
+            </w:r>
+            <w:r>
+              <w:t xml:space="preserve">. Chuỗi tiến bộ được ngắt và đánh dấu tại chỗ đổi </w:t>
+            </w:r>
+            <w:r>
+              <w:rPr>
+                <w:rFonts w:ascii="Consolas" w:hAnsi="Consolas"/>
+                <w:color w:val="1B3A6B"/>
+              </w:rPr>
+              <w:t>scorer_version</w:t>
+            </w:r>
+            <w:r>
+              <w:t>; điểm trước và sau không được nối thành một đường liên tục khi chưa hiệu chuẩn lại.</w:t>
+            </w:r>
+          </w:p>
+        </w:tc>
+        <w:tc>
+          <w:tcPr>
+            <w:tcW w:type="dxa" w:w="2880"/>
+          </w:tcPr>
+          <w:p>
+            <w:r/>
+            <w:r>
+              <w:t>Hợp đồng §1.4.2 · Đề xuất</w:t>
+            </w:r>
+          </w:p>
+        </w:tc>
+      </w:tr>
+      <w:tr>
+        <w:tc>
+          <w:tcPr>
+            <w:tcW w:type="dxa" w:w="2880"/>
+          </w:tcPr>
+          <w:p>
+            <w:r/>
+            <w:r>
+              <w:t>NFR-09</w:t>
+            </w:r>
+          </w:p>
+        </w:tc>
+        <w:tc>
+          <w:tcPr>
+            <w:tcW w:type="dxa" w:w="2880"/>
+          </w:tcPr>
+          <w:p>
+            <w:r/>
+            <w:r>
+              <w:t xml:space="preserve">Bộ hiệu chuẩn chấm (P-03) chạy trong CI mỗi khi prompt chấm, mô hình chấm hoặc rubric thay đổi; MDC95 tăng quá ngưỡng thì chặn phát hành. Ngưỡng: </w:t>
+            </w:r>
+            <w:r>
+              <w:rPr>
+                <w:i/>
+              </w:rPr>
+              <w:t>Chờ xác định</w:t>
+            </w:r>
+            <w:r>
+              <w:t>.</w:t>
+            </w:r>
+          </w:p>
+        </w:tc>
+        <w:tc>
+          <w:tcPr>
+            <w:tcW w:type="dxa" w:w="2880"/>
+          </w:tcPr>
+          <w:p>
+            <w:r/>
+            <w:r>
+              <w:t>Đề xuất</w:t>
             </w:r>
           </w:p>
         </w:tc>
@@ -4826,6 +8294,464 @@
           <w:p>
             <w:r/>
             <w:r>
+              <w:t>GC-SEC-02</w:t>
+            </w:r>
+          </w:p>
+        </w:tc>
+        <w:tc>
+          <w:tcPr>
+            <w:tcW w:type="dxa" w:w="2880"/>
+          </w:tcPr>
+          <w:p>
+            <w:r/>
+            <w:r>
+              <w:t xml:space="preserve">Gọi </w:t>
+            </w:r>
+            <w:r>
+              <w:rPr>
+                <w:rFonts w:ascii="Consolas" w:hAnsi="Consolas"/>
+                <w:color w:val="1B3A6B"/>
+              </w:rPr>
+              <w:t>POST /api/v1/matching/match-ids</w:t>
+            </w:r>
+            <w:r>
+              <w:t xml:space="preserve"> không có token, và có token của A với id CV của B.</w:t>
+            </w:r>
+          </w:p>
+        </w:tc>
+        <w:tc>
+          <w:tcPr>
+            <w:tcW w:type="dxa" w:w="2880"/>
+          </w:tcPr>
+          <w:p>
+            <w:r/>
+            <w:r>
+              <w:t xml:space="preserve">401 cho trường hợp đầu; 404 cho trường hợp sau. </w:t>
+            </w:r>
+            <w:r>
+              <w:rPr>
+                <w:b/>
+              </w:rPr>
+              <w:t>Hiện trượt.</w:t>
+            </w:r>
+          </w:p>
+        </w:tc>
+      </w:tr>
+      <w:tr>
+        <w:tc>
+          <w:tcPr>
+            <w:tcW w:type="dxa" w:w="2880"/>
+          </w:tcPr>
+          <w:p>
+            <w:r/>
+            <w:r>
+              <w:t>GC-PROG-01</w:t>
+            </w:r>
+          </w:p>
+        </w:tc>
+        <w:tc>
+          <w:tcPr>
+            <w:tcW w:type="dxa" w:w="2880"/>
+          </w:tcPr>
+          <w:p>
+            <w:r/>
+            <w:r>
+              <w:t>Ứng viên xóa CV đã dùng cho 3 phiên.</w:t>
+            </w:r>
+          </w:p>
+        </w:tc>
+        <w:tc>
+          <w:tcPr>
+            <w:tcW w:type="dxa" w:w="2880"/>
+          </w:tcPr>
+          <w:p>
+            <w:r/>
+            <w:r>
+              <w:t xml:space="preserve">Cả 3 phiên và báo cáo vẫn xem được (P-12). </w:t>
+            </w:r>
+            <w:r>
+              <w:rPr>
+                <w:b/>
+              </w:rPr>
+              <w:t>Hiện trượt.</w:t>
+            </w:r>
+          </w:p>
+        </w:tc>
+      </w:tr>
+      <w:tr>
+        <w:tc>
+          <w:tcPr>
+            <w:tcW w:type="dxa" w:w="2880"/>
+          </w:tcPr>
+          <w:p>
+            <w:r/>
+            <w:r>
+              <w:t>GC-PROG-02</w:t>
+            </w:r>
+          </w:p>
+        </w:tc>
+        <w:tc>
+          <w:tcPr>
+            <w:tcW w:type="dxa" w:w="2880"/>
+          </w:tcPr>
+          <w:p>
+            <w:r/>
+            <w:r>
+              <w:t xml:space="preserve">Hai phiên với hai JD khác nhau cùng có câu thuộc khái niệm </w:t>
+            </w:r>
+            <w:r>
+              <w:rPr>
+                <w:rFonts w:ascii="Consolas" w:hAnsi="Consolas"/>
+                <w:color w:val="1B3A6B"/>
+              </w:rPr>
+              <w:t>caching</w:t>
+            </w:r>
+            <w:r>
+              <w:t>.</w:t>
+            </w:r>
+          </w:p>
+        </w:tc>
+        <w:tc>
+          <w:tcPr>
+            <w:tcW w:type="dxa" w:w="2880"/>
+          </w:tcPr>
+          <w:p>
+            <w:r/>
+            <w:r>
+              <w:rPr>
+                <w:rFonts w:ascii="Consolas" w:hAnsi="Consolas"/>
+                <w:color w:val="1B3A6B"/>
+              </w:rPr>
+              <w:t>GET /progress/skills</w:t>
+            </w:r>
+            <w:r>
+              <w:t xml:space="preserve"> trả một dòng </w:t>
+            </w:r>
+            <w:r>
+              <w:rPr>
+                <w:rFonts w:ascii="Consolas" w:hAnsi="Consolas"/>
+                <w:color w:val="1B3A6B"/>
+              </w:rPr>
+              <w:t>caching</w:t>
+            </w:r>
+            <w:r>
+              <w:t xml:space="preserve"> với 2 quan sát (P-01).</w:t>
+            </w:r>
+          </w:p>
+        </w:tc>
+      </w:tr>
+      <w:tr>
+        <w:tc>
+          <w:tcPr>
+            <w:tcW w:type="dxa" w:w="2880"/>
+          </w:tcPr>
+          <w:p>
+            <w:r/>
+            <w:r>
+              <w:t>GC-PROG-03</w:t>
+            </w:r>
+          </w:p>
+        </w:tc>
+        <w:tc>
+          <w:tcPr>
+            <w:tcW w:type="dxa" w:w="2880"/>
+          </w:tcPr>
+          <w:p>
+            <w:r/>
+            <w:r>
+              <w:t xml:space="preserve">Hai lần trả lời cùng câu neo </w:t>
+            </w:r>
+            <w:r>
+              <w:rPr>
+                <w:rFonts w:ascii="Consolas" w:hAnsi="Consolas"/>
+                <w:color w:val="1B3A6B"/>
+              </w:rPr>
+              <w:t>caching</w:t>
+            </w:r>
+            <w:r>
+              <w:t>, điểm tăng 0,4, MDC95 = 0,9.</w:t>
+            </w:r>
+          </w:p>
+        </w:tc>
+        <w:tc>
+          <w:tcPr>
+            <w:tcW w:type="dxa" w:w="2880"/>
+          </w:tcPr>
+          <w:p>
+            <w:r/>
+            <w:r>
+              <w:t>Nhãn TRONG BIÊN NHIỄU; không có chữ "tiến bộ" (SF-07).</w:t>
+            </w:r>
+          </w:p>
+        </w:tc>
+      </w:tr>
+      <w:tr>
+        <w:tc>
+          <w:tcPr>
+            <w:tcW w:type="dxa" w:w="2880"/>
+          </w:tcPr>
+          <w:p>
+            <w:r/>
+            <w:r>
+              <w:t>GC-PROG-04</w:t>
+            </w:r>
+          </w:p>
+        </w:tc>
+        <w:tc>
+          <w:tcPr>
+            <w:tcW w:type="dxa" w:w="2880"/>
+          </w:tcPr>
+          <w:p>
+            <w:r/>
+            <w:r>
+              <w:t>Hai lần trả lời cùng câu neo, điểm tăng 1,5, MDC95 = 0,9.</w:t>
+            </w:r>
+          </w:p>
+        </w:tc>
+        <w:tc>
+          <w:tcPr>
+            <w:tcW w:type="dxa" w:w="2880"/>
+          </w:tcPr>
+          <w:p>
+            <w:r/>
+            <w:r>
+              <w:t>Nhãn TIẾN BỘ THẬT.</w:t>
+            </w:r>
+          </w:p>
+        </w:tc>
+      </w:tr>
+      <w:tr>
+        <w:tc>
+          <w:tcPr>
+            <w:tcW w:type="dxa" w:w="2880"/>
+          </w:tcPr>
+          <w:p>
+            <w:r/>
+            <w:r>
+              <w:t>GC-PROG-04b</w:t>
+            </w:r>
+          </w:p>
+        </w:tc>
+        <w:tc>
+          <w:tcPr>
+            <w:tcW w:type="dxa" w:w="2880"/>
+          </w:tcPr>
+          <w:p>
+            <w:r/>
+            <w:r>
+              <w:t xml:space="preserve">Hai lượt liền nhau trên </w:t>
+            </w:r>
+            <w:r>
+              <w:rPr>
+                <w:b/>
+              </w:rPr>
+              <w:t>hai câu khác nhau</w:t>
+            </w:r>
+            <w:r>
+              <w:t>, điểm tăng 2,0.</w:t>
+            </w:r>
+          </w:p>
+        </w:tc>
+        <w:tc>
+          <w:tcPr>
+            <w:tcW w:type="dxa" w:w="2880"/>
+          </w:tcPr>
+          <w:p>
+            <w:r/>
+            <w:r>
+              <w:t>Không gắn TIẾN BỘ THẬT; chỉ được dùng trong ước lượng cửa sổ (P-04b).</w:t>
+            </w:r>
+          </w:p>
+        </w:tc>
+      </w:tr>
+      <w:tr>
+        <w:tc>
+          <w:tcPr>
+            <w:tcW w:type="dxa" w:w="2880"/>
+          </w:tcPr>
+          <w:p>
+            <w:r/>
+            <w:r>
+              <w:t>GC-PROG-05</w:t>
+            </w:r>
+          </w:p>
+        </w:tc>
+        <w:tc>
+          <w:tcPr>
+            <w:tcW w:type="dxa" w:w="2880"/>
+          </w:tcPr>
+          <w:p>
+            <w:r/>
+            <w:r>
+              <w:t xml:space="preserve">Giữa hai quan sát có đổi </w:t>
+            </w:r>
+            <w:r>
+              <w:rPr>
+                <w:rFonts w:ascii="Consolas" w:hAnsi="Consolas"/>
+                <w:color w:val="1B3A6B"/>
+              </w:rPr>
+              <w:t>scorer_version</w:t>
+            </w:r>
+            <w:r>
+              <w:t>.</w:t>
+            </w:r>
+          </w:p>
+        </w:tc>
+        <w:tc>
+          <w:tcPr>
+            <w:tcW w:type="dxa" w:w="2880"/>
+          </w:tcPr>
+          <w:p>
+            <w:r/>
+            <w:r>
+              <w:t>Chuỗi bị ngắt và đánh dấu; không tính chỉ báo P-04 qua chỗ ngắt (NFR-08).</w:t>
+            </w:r>
+          </w:p>
+        </w:tc>
+      </w:tr>
+      <w:tr>
+        <w:tc>
+          <w:tcPr>
+            <w:tcW w:type="dxa" w:w="2880"/>
+          </w:tcPr>
+          <w:p>
+            <w:r/>
+            <w:r>
+              <w:t>GC-PROG-06</w:t>
+            </w:r>
+          </w:p>
+        </w:tc>
+        <w:tc>
+          <w:tcPr>
+            <w:tcW w:type="dxa" w:w="2880"/>
+          </w:tcPr>
+          <w:p>
+            <w:r/>
+            <w:r>
+              <w:t xml:space="preserve">Phiên đóng với </w:t>
+            </w:r>
+            <w:r>
+              <w:rPr>
+                <w:rFonts w:ascii="Consolas" w:hAnsi="Consolas"/>
+                <w:color w:val="1B3A6B"/>
+              </w:rPr>
+              <w:t>TECHNICAL_FAILURE</w:t>
+            </w:r>
+            <w:r>
+              <w:t>, và một phiên khởi động F-07.</w:t>
+            </w:r>
+          </w:p>
+        </w:tc>
+        <w:tc>
+          <w:tcPr>
+            <w:tcW w:type="dxa" w:w="2880"/>
+          </w:tcPr>
+          <w:p>
+            <w:r/>
+            <w:r>
+              <w:t>Không sinh quan sát nào trong sổ kỹ năng.</w:t>
+            </w:r>
+          </w:p>
+        </w:tc>
+      </w:tr>
+      <w:tr>
+        <w:tc>
+          <w:tcPr>
+            <w:tcW w:type="dxa" w:w="2880"/>
+          </w:tcPr>
+          <w:p>
+            <w:r/>
+            <w:r>
+              <w:t>GC-PROG-07</w:t>
+            </w:r>
+          </w:p>
+        </w:tc>
+        <w:tc>
+          <w:tcPr>
+            <w:tcW w:type="dxa" w:w="2880"/>
+          </w:tcPr>
+          <w:p>
+            <w:r/>
+            <w:r>
+              <w:t xml:space="preserve">Lượt </w:t>
+            </w:r>
+            <w:r>
+              <w:rPr>
+                <w:rFonts w:ascii="Consolas" w:hAnsi="Consolas"/>
+                <w:color w:val="1B3A6B"/>
+              </w:rPr>
+              <w:t>graded = false</w:t>
+            </w:r>
+            <w:r>
+              <w:t xml:space="preserve">, và lượt </w:t>
+            </w:r>
+            <w:r>
+              <w:rPr>
+                <w:rFonts w:ascii="Consolas" w:hAnsi="Consolas"/>
+                <w:color w:val="1B3A6B"/>
+              </w:rPr>
+              <w:t>warmup</w:t>
+            </w:r>
+            <w:r>
+              <w:t>.</w:t>
+            </w:r>
+          </w:p>
+        </w:tc>
+        <w:tc>
+          <w:tcPr>
+            <w:tcW w:type="dxa" w:w="2880"/>
+          </w:tcPr>
+          <w:p>
+            <w:r/>
+            <w:r>
+              <w:t>Không sinh quan sát nào.</w:t>
+            </w:r>
+          </w:p>
+        </w:tc>
+      </w:tr>
+      <w:tr>
+        <w:tc>
+          <w:tcPr>
+            <w:tcW w:type="dxa" w:w="2880"/>
+          </w:tcPr>
+          <w:p>
+            <w:r/>
+            <w:r>
+              <w:t>GC-PROG-08</w:t>
+            </w:r>
+          </w:p>
+        </w:tc>
+        <w:tc>
+          <w:tcPr>
+            <w:tcW w:type="dxa" w:w="2880"/>
+          </w:tcPr>
+          <w:p>
+            <w:r/>
+            <w:r>
+              <w:t>Người dùng mới, chưa có phiên.</w:t>
+            </w:r>
+          </w:p>
+        </w:tc>
+        <w:tc>
+          <w:tcPr>
+            <w:tcW w:type="dxa" w:w="2880"/>
+          </w:tcPr>
+          <w:p>
+            <w:r/>
+            <w:r>
+              <w:t>Bảng điều khiển không hiện số giả hay "—"; có giải thích cách đo và nút bắt đầu (P-13).</w:t>
+            </w:r>
+          </w:p>
+        </w:tc>
+      </w:tr>
+      <w:tr>
+        <w:tc>
+          <w:tcPr>
+            <w:tcW w:type="dxa" w:w="2880"/>
+          </w:tcPr>
+          <w:p>
+            <w:r/>
+            <w:r>
               <w:t>GC-REP-01</w:t>
             </w:r>
           </w:p>
@@ -4991,7 +8917,7 @@
           <w:p>
             <w:r/>
             <w:r>
-              <w:t>Số severe failure (SF-01 đến SF-06), cộng tỉ lệ phục hồi sau một lần hiểu nhầm</w:t>
+              <w:t>Số severe failure (SF-01 đến SF-07), cộng tỉ lệ phục hồi sau một lần hiểu nhầm</w:t>
             </w:r>
           </w:p>
         </w:tc>
@@ -5086,6 +9012,58 @@
       </w:r>
       <w:r>
         <w:t>. Chưa có người dùng thật để có số nền.</w:t>
+      </w:r>
+    </w:p>
+    <w:p>
+      <w:r>
+        <w:rPr>
+          <w:b/>
+        </w:rPr>
+        <w:t>Chỉ số cho Hồ sơ tiến bộ</w:t>
+      </w:r>
+      <w:r>
+        <w:t xml:space="preserve"> [Đề xuất], tất cả </w:t>
+      </w:r>
+      <w:r>
+        <w:rPr>
+          <w:i/>
+        </w:rPr>
+        <w:t>Chờ đo</w:t>
+      </w:r>
+      <w:r>
+        <w:t>:</w:t>
+      </w:r>
+    </w:p>
+    <w:p>
+      <w:pPr>
+        <w:pStyle w:val="ListBullet"/>
+      </w:pPr>
+      <w:r>
+        <w:t>MDC95 trung vị theo khái niệm trên bộ hiệu chuẩn — càng nhỏ, hệ thống càng phát hiện được tiến bộ nhỏ.</w:t>
+      </w:r>
+    </w:p>
+    <w:p>
+      <w:pPr>
+        <w:pStyle w:val="ListBullet"/>
+      </w:pPr>
+      <w:r>
+        <w:t>Tỉ lệ người dùng có ít nhất 2 quan sát trên cùng một khái niệm trong 14 ngày — điều kiện để hồ sơ tiến bộ có nghĩa.</w:t>
+      </w:r>
+    </w:p>
+    <w:p>
+      <w:pPr>
+        <w:pStyle w:val="ListBullet"/>
+      </w:pPr>
+      <w:r>
+        <w:t>Tỉ lệ khái niệm đạt TIẾN BỘ THẬT sau 3 buổi luyện có mục tiêu.</w:t>
+      </w:r>
+    </w:p>
+    <w:p>
+      <w:pPr>
+        <w:pStyle w:val="ListBullet"/>
+      </w:pPr>
+      <w:r>
+        <w:t>Tỉ lệ quay lại sau 7 ngày và 30 ngày.</w:t>
       </w:r>
     </w:p>
     <w:p>
@@ -5632,7 +9610,7 @@
               <w:t>evaluation_engine.py</w:t>
             </w:r>
             <w:r>
-              <w:t>) mà không đối chiếu với câu trả lời. Một trích dẫn bịa là SF-01. Giảm rủi ro bằng luật ở mục 7.4.</w:t>
+              <w:t>) mà không đối chiếu với câu trả lời. Một trích dẫn bịa là SF-01. Giảm rủi ro bằng luật ở mục 7.9.</w:t>
             </w:r>
           </w:p>
         </w:tc>
@@ -5753,6 +9731,226 @@
             </w:r>
             <w:r>
               <w:t xml:space="preserve"> Câu hỏi do AI sinh và câu PROBE chưa qua bộ lọc thuộc tính được bảo vệ.</w:t>
+            </w:r>
+          </w:p>
+        </w:tc>
+      </w:tr>
+      <w:tr>
+        <w:tc>
+          <w:tcPr>
+            <w:tcW w:type="dxa" w:w="4320"/>
+          </w:tcPr>
+          <w:p>
+            <w:r/>
+            <w:r>
+              <w:t>RK-10</w:t>
+            </w:r>
+          </w:p>
+        </w:tc>
+        <w:tc>
+          <w:tcPr>
+            <w:tcW w:type="dxa" w:w="4320"/>
+          </w:tcPr>
+          <w:p>
+            <w:r/>
+            <w:r>
+              <w:rPr>
+                <w:b/>
+              </w:rPr>
+              <w:t>Endpoint đối chiếu không xác thực, đọc CV không lọc người dùng.</w:t>
+            </w:r>
+            <w:r>
+              <w:t xml:space="preserve"> Ai biết id CV đều đọc được dữ liệu CV của người khác và có thể đốt chi phí mô hình. [Code — </w:t>
+            </w:r>
+            <w:r>
+              <w:rPr>
+                <w:rFonts w:ascii="Consolas" w:hAnsi="Consolas"/>
+                <w:color w:val="1B3A6B"/>
+              </w:rPr>
+              <w:t>matching/api/router.py</w:t>
+            </w:r>
+            <w:r>
+              <w:t xml:space="preserve">, </w:t>
+            </w:r>
+            <w:r>
+              <w:rPr>
+                <w:rFonts w:ascii="Consolas" w:hAnsi="Consolas"/>
+                <w:color w:val="1B3A6B"/>
+              </w:rPr>
+              <w:t>matching/application/input_resolver.py:25</w:t>
+            </w:r>
+            <w:r>
+              <w:t>]</w:t>
+            </w:r>
+          </w:p>
+        </w:tc>
+      </w:tr>
+      <w:tr>
+        <w:tc>
+          <w:tcPr>
+            <w:tcW w:type="dxa" w:w="4320"/>
+          </w:tcPr>
+          <w:p>
+            <w:r/>
+            <w:r>
+              <w:t>RK-11</w:t>
+            </w:r>
+          </w:p>
+        </w:tc>
+        <w:tc>
+          <w:tcPr>
+            <w:tcW w:type="dxa" w:w="4320"/>
+          </w:tcPr>
+          <w:p>
+            <w:r/>
+            <w:r>
+              <w:rPr>
+                <w:b/>
+              </w:rPr>
+              <w:t>Xóa CV làm mất lịch sử.</w:t>
+            </w:r>
+            <w:r>
+              <w:t xml:space="preserve"> Phá hỏng mọi tính năng tiến bộ từ gốc. Xem P-12.</w:t>
+            </w:r>
+          </w:p>
+        </w:tc>
+      </w:tr>
+      <w:tr>
+        <w:tc>
+          <w:tcPr>
+            <w:tcW w:type="dxa" w:w="4320"/>
+          </w:tcPr>
+          <w:p>
+            <w:r/>
+            <w:r>
+              <w:t>RK-12</w:t>
+            </w:r>
+          </w:p>
+        </w:tc>
+        <w:tc>
+          <w:tcPr>
+            <w:tcW w:type="dxa" w:w="4320"/>
+          </w:tcPr>
+          <w:p>
+            <w:r/>
+            <w:r>
+              <w:rPr>
+                <w:b/>
+              </w:rPr>
+              <w:t>Marketing tuyên bố không có căn cứ.</w:t>
+            </w:r>
+            <w:r>
+              <w:t xml:space="preserve"> Frontend hiển thị "98% Accuracy", "Sentiment Analysis Engine" và lời chứng thực của nhân vật hư cấu; thanh toán VietQR là giả; credit không bao giờ bị trừ. [Code — frontend </w:t>
+            </w:r>
+            <w:r>
+              <w:rPr>
+                <w:rFonts w:ascii="Consolas" w:hAnsi="Consolas"/>
+                <w:color w:val="1B3A6B"/>
+              </w:rPr>
+              <w:t>i18n.ts</w:t>
+            </w:r>
+            <w:r>
+              <w:t xml:space="preserve">, </w:t>
+            </w:r>
+            <w:r>
+              <w:rPr>
+                <w:rFonts w:ascii="Consolas" w:hAnsi="Consolas"/>
+                <w:color w:val="1B3A6B"/>
+              </w:rPr>
+              <w:t>VietQrModal.tsx</w:t>
+            </w:r>
+            <w:r>
+              <w:t>]</w:t>
+            </w:r>
+          </w:p>
+        </w:tc>
+      </w:tr>
+      <w:tr>
+        <w:tc>
+          <w:tcPr>
+            <w:tcW w:type="dxa" w:w="4320"/>
+          </w:tcPr>
+          <w:p>
+            <w:r/>
+            <w:r>
+              <w:t>RK-13</w:t>
+            </w:r>
+          </w:p>
+        </w:tc>
+        <w:tc>
+          <w:tcPr>
+            <w:tcW w:type="dxa" w:w="4320"/>
+          </w:tcPr>
+          <w:p>
+            <w:r/>
+            <w:r>
+              <w:rPr>
+                <w:b/>
+              </w:rPr>
+              <w:t>Biểu đồ tiến bộ vẽ nhiễu.</w:t>
+            </w:r>
+            <w:r>
+              <w:t xml:space="preserve"> Nếu làm màn hình trước khi có P-01 đến P-03, người dùng sẽ thấy "tiến bộ" và "thụt lùi" do mô hình chấm dao động, và mất niềm tin khi nhận ra.</w:t>
+            </w:r>
+          </w:p>
+        </w:tc>
+      </w:tr>
+      <w:tr>
+        <w:tc>
+          <w:tcPr>
+            <w:tcW w:type="dxa" w:w="4320"/>
+          </w:tcPr>
+          <w:p>
+            <w:r/>
+            <w:r>
+              <w:t>RK-14</w:t>
+            </w:r>
+          </w:p>
+        </w:tc>
+        <w:tc>
+          <w:tcPr>
+            <w:tcW w:type="dxa" w:w="4320"/>
+          </w:tcPr>
+          <w:p>
+            <w:r/>
+            <w:r>
+              <w:rPr>
+                <w:b/>
+              </w:rPr>
+              <w:t>Ngân hàng câu hỏi mỏng.</w:t>
+            </w:r>
+            <w:r>
+              <w:t xml:space="preserve"> 130 câu seed dùng chung một rubric chung chung, không có ý bắt buộc; P-02 chỉ có giá trị khi rubric từng câu đủ cụ thể.</w:t>
+            </w:r>
+          </w:p>
+        </w:tc>
+      </w:tr>
+      <w:tr>
+        <w:tc>
+          <w:tcPr>
+            <w:tcW w:type="dxa" w:w="4320"/>
+          </w:tcPr>
+          <w:p>
+            <w:r/>
+            <w:r>
+              <w:t>RK-15</w:t>
+            </w:r>
+          </w:p>
+        </w:tc>
+        <w:tc>
+          <w:tcPr>
+            <w:tcW w:type="dxa" w:w="4320"/>
+          </w:tcPr>
+          <w:p>
+            <w:r/>
+            <w:r>
+              <w:rPr>
+                <w:b/>
+              </w:rPr>
+              <w:t>Đường tiến bộ phẳng làm người dùng bỏ đi.</w:t>
+            </w:r>
+            <w:r>
+              <w:t xml:space="preserve"> Nếu MDC95 thật vào khoảng 1 điểm trên thang 10, phần lớn thay đổi giữa hai buổi sẽ là TRONG BIÊN NHIỄU; người dùng thấy đường phẳng và nghĩ luyện không có tác dụng. Giảm rủi ro bằng: nhảy mức 0–3 ở từng tiêu chí (rời rạc, dễ thấy hơn điểm tổng); ước lượng cửa sổ có sai số giảm dần khi tích lũy quan sát; tiến bộ không dựa vào điểm (tuyên bố CV chuyển sang VỮNG, số khái niệm đã đo, câu neo đã làm lại).</w:t>
             </w:r>
           </w:p>
         </w:tc>
@@ -6209,11 +10407,43 @@
       </w:r>
     </w:p>
     <w:p>
+      <w:pPr>
+        <w:pStyle w:val="ListBullet"/>
+      </w:pPr>
+      <w:r>
+        <w:t>ChatGPT cho luyện phỏng vấn: https://mockif.com/chatgpt-mock-interview · https://www.makeuseof.com/how-use-chatgpt-voice-mode-interview-preparation/ · https://mocky.pro/en/blog/chatgpt-vs-gemini-interview-prep</w:t>
+      </w:r>
+    </w:p>
+    <w:p>
+      <w:pPr>
+        <w:pStyle w:val="ListBullet"/>
+      </w:pPr>
+      <w:r>
+        <w:t>Bảng điều khiển tiến bộ của đối thủ: https://www.tryexponent.com/blog/new-my-progress-dashboard · https://yoodli.ai/blog/introducing-analytics-centralized-insights-within-yoodli · https://www.producthunt.com/posts/1239902</w:t>
+      </w:r>
+    </w:p>
+    <w:p>
+      <w:pPr>
+        <w:pStyle w:val="ListBullet"/>
+      </w:pPr>
+      <w:r>
+        <w:t>Độ không ổn định của LLM khi chấm: https://arxiv.org/abs/2506.22316 · https://www.alphaxiv.org/abs/2603.04417 · https://arxiv.org/abs/2509.21117v2</w:t>
+      </w:r>
+    </w:p>
+    <w:p>
+      <w:pPr>
+        <w:pStyle w:val="ListBullet"/>
+      </w:pPr>
+      <w:r>
+        <w:t>Luyện tập có chủ đích: https://notes.andymatuschak.org/zAEV61QhJaiWLYQ8vZF36uT · https://www.iatrox.com/blog/unlimited-ai-osce-practice-deliberate-practice-or-rehearsing-mistakes</w:t>
+      </w:r>
+    </w:p>
+    <w:p>
       <w:r>
         <w:rPr>
           <w:i/>
         </w:rPr>
-        <w:t>INTV-PRD-001 · v1.0 · INTERVIA</w:t>
+        <w:t>INTV-PRD-001 · v1.1 · INTERVIA</w:t>
       </w:r>
     </w:p>
     <w:sectPr>

</xml_diff>